<commit_message>
test(qa): ejecutar casos de revisión y actualizar documentación
Ejecuta MVC-GEN-05 en Chromium, Firefox y WebKit y registra las
revisiones de MVC-GEN-03 (bloqueado sin acceso a Figma), MVC-GEN-04,
SW-09 y ENT-12. Agrega DEF-09 a DEF-11 y actualiza la matriz, la
sección 3.9 y los README de QA. Los generadores ignoran las copias de
sincronización con sufijo " 2".
</commit_message>
<xml_diff>
--- a/QA/Laboratorio 1 — Implementación de Monolito con patrón MVC y DAO_QA.docx
+++ b/QA/Laboratorio 1 — Implementación de Monolito con patrón MVC y DAO_QA.docx
@@ -2925,7 +2925,7 @@
                 <w:sz w:val="20"/>
                 <w:szCs w:val="20"/>
               </w:rPr>
-              <w:t xml:space="preserve">sqlcmd (mssql-tools18) dentro del contenedor; Python 3.14 con requests, openapi-spec-validator y Playwright (Chromium); PowerShell 7.4 en contenedor</w:t>
+              <w:t xml:space="preserve">sqlcmd (mssql-tools18) dentro del contenedor; Python 3.14 con requests, openapi-spec-validator y Playwright (Chromium 156, Firefox 157 y WebKit 27.2); PowerShell 7.4 en contenedor</w:t>
             </w:r>
           </w:p>
         </w:tc>
@@ -3039,6 +3039,24 @@
           <w:szCs w:val="24"/>
         </w:rPr>
         <w:t xml:space="preserve">La API, Swagger y la revisión del backend se ejecutaron primero en main y luego en la rama del Pull Request como prueba de regresión, con los mismos resultados en ambas ramas. Las vistas MVC y la integración se probaron en la rama del Pull Request, que es la que contiene el frontend. Como evidencia complementaria se ejecutó sin cambios el script tests/mvc-smoke.ps1 del equipo, que terminó con 213 comprobaciones HTTP correctas.</w:t>
+      </w:r>
+    </w:p>
+    <w:p>
+      <w:pPr>
+        <w:ind w:left="720" w:firstLine="0"/>
+        <w:rPr>
+          <w:rFonts w:ascii="Times New Roman" w:cs="Times New Roman" w:eastAsia="Times New Roman" w:hAnsi="Times New Roman"/>
+          <w:sz w:val="24"/>
+          <w:szCs w:val="24"/>
+        </w:rPr>
+      </w:pPr>
+      <w:r>
+        <w:rPr>
+          <w:rFonts w:ascii="Times New Roman" w:cs="Times New Roman" w:eastAsia="Times New Roman" w:hAnsi="Times New Roman"/>
+          <w:sz w:val="24"/>
+          <w:szCs w:val="24"/>
+        </w:rPr>
+        <w:t xml:space="preserve">Los casos de revisión se ejecutaron después sobre main integrada. MVC-GEN-05 repitió un flujo completo con Playwright en Chromium (motor de Chrome y Edge), Firefox y WebKit (motor de Safari). MVC-GEN-04, SW-09 y ENT-12 se apoyaron en mediciones automáticas (desbordes y tamaño de letra en tres anchos de pantalla, descripciones del documento OpenAPI y estilos y redacción del documento); el criterio aplicado quedó escrito en la matriz para su confirmación por el responsable de QA.</w:t>
       </w:r>
     </w:p>
     <w:p>
@@ -3903,6 +3921,30 @@
                 <w:sz w:val="20"/>
                 <w:szCs w:val="20"/>
               </w:rPr>
+              <w:t xml:space="preserve">1</w:t>
+            </w:r>
+          </w:p>
+        </w:tc>
+        <w:tc>
+          <w:tcPr>
+            <w:tcW w:w="1200" w:type="dxa"/>
+          </w:tcPr>
+          <w:p>
+            <w:pPr>
+              <w:spacing w:before="40" w:after="40" w:line="240" w:lineRule="auto"/>
+              <w:jc w:val="center"/>
+              <w:rPr>
+                <w:rFonts w:ascii="Times New Roman" w:cs="Times New Roman" w:eastAsia="Times New Roman" w:hAnsi="Times New Roman"/>
+                <w:sz w:val="20"/>
+                <w:szCs w:val="20"/>
+              </w:rPr>
+            </w:pPr>
+            <w:r>
+              <w:rPr>
+                <w:rFonts w:ascii="Times New Roman" w:cs="Times New Roman" w:eastAsia="Times New Roman" w:hAnsi="Times New Roman"/>
+                <w:sz w:val="20"/>
+                <w:szCs w:val="20"/>
+              </w:rPr>
               <w:t xml:space="preserve">0</w:t>
             </w:r>
           </w:p>
@@ -3928,30 +3970,6 @@
                 <w:szCs w:val="20"/>
               </w:rPr>
               <w:t xml:space="preserve">0</w:t>
-            </w:r>
-          </w:p>
-        </w:tc>
-        <w:tc>
-          <w:tcPr>
-            <w:tcW w:w="1200" w:type="dxa"/>
-          </w:tcPr>
-          <w:p>
-            <w:pPr>
-              <w:spacing w:before="40" w:after="40" w:line="240" w:lineRule="auto"/>
-              <w:jc w:val="center"/>
-              <w:rPr>
-                <w:rFonts w:ascii="Times New Roman" w:cs="Times New Roman" w:eastAsia="Times New Roman" w:hAnsi="Times New Roman"/>
-                <w:sz w:val="20"/>
-                <w:szCs w:val="20"/>
-              </w:rPr>
-            </w:pPr>
-            <w:r>
-              <w:rPr>
-                <w:rFonts w:ascii="Times New Roman" w:cs="Times New Roman" w:eastAsia="Times New Roman" w:hAnsi="Times New Roman"/>
-                <w:sz w:val="20"/>
-                <w:szCs w:val="20"/>
-              </w:rPr>
-              <w:t xml:space="preserve">1</w:t>
             </w:r>
           </w:p>
         </w:tc>
@@ -4049,7 +4067,7 @@
                 <w:sz w:val="20"/>
                 <w:szCs w:val="20"/>
               </w:rPr>
-              <w:t xml:space="preserve">31</w:t>
+              <w:t xml:space="preserve">33</w:t>
             </w:r>
           </w:p>
         </w:tc>
@@ -4097,13 +4115,37 @@
                 <w:sz w:val="20"/>
                 <w:szCs w:val="20"/>
               </w:rPr>
+              <w:t xml:space="preserve">1</w:t>
+            </w:r>
+          </w:p>
+        </w:tc>
+        <w:tc>
+          <w:tcPr>
+            <w:tcW w:w="1200" w:type="dxa"/>
+          </w:tcPr>
+          <w:p>
+            <w:pPr>
+              <w:spacing w:before="40" w:after="40" w:line="240" w:lineRule="auto"/>
+              <w:jc w:val="center"/>
+              <w:rPr>
+                <w:rFonts w:ascii="Times New Roman" w:cs="Times New Roman" w:eastAsia="Times New Roman" w:hAnsi="Times New Roman"/>
+                <w:sz w:val="20"/>
+                <w:szCs w:val="20"/>
+              </w:rPr>
+            </w:pPr>
+            <w:r>
+              <w:rPr>
+                <w:rFonts w:ascii="Times New Roman" w:cs="Times New Roman" w:eastAsia="Times New Roman" w:hAnsi="Times New Roman"/>
+                <w:sz w:val="20"/>
+                <w:szCs w:val="20"/>
+              </w:rPr>
               <w:t xml:space="preserve">0</w:t>
             </w:r>
           </w:p>
         </w:tc>
         <w:tc>
           <w:tcPr>
-            <w:tcW w:w="1200" w:type="dxa"/>
+            <w:tcW w:w="1150" w:type="dxa"/>
           </w:tcPr>
           <w:p>
             <w:pPr>
@@ -4121,31 +4163,7 @@
                 <w:sz w:val="20"/>
                 <w:szCs w:val="20"/>
               </w:rPr>
-              <w:t xml:space="preserve">3</w:t>
-            </w:r>
-          </w:p>
-        </w:tc>
-        <w:tc>
-          <w:tcPr>
-            <w:tcW w:w="1150" w:type="dxa"/>
-          </w:tcPr>
-          <w:p>
-            <w:pPr>
-              <w:spacing w:before="40" w:after="40" w:line="240" w:lineRule="auto"/>
-              <w:jc w:val="center"/>
-              <w:rPr>
-                <w:rFonts w:ascii="Times New Roman" w:cs="Times New Roman" w:eastAsia="Times New Roman" w:hAnsi="Times New Roman"/>
-                <w:sz w:val="20"/>
-                <w:szCs w:val="20"/>
-              </w:rPr>
-            </w:pPr>
-            <w:r>
-              <w:rPr>
-                <w:rFonts w:ascii="Times New Roman" w:cs="Times New Roman" w:eastAsia="Times New Roman" w:hAnsi="Times New Roman"/>
-                <w:sz w:val="20"/>
-                <w:szCs w:val="20"/>
-              </w:rPr>
-              <w:t xml:space="preserve">77,5 %</w:t>
+              <w:t xml:space="preserve">82,5 %</w:t>
             </w:r>
           </w:p>
         </w:tc>
@@ -4413,7 +4431,7 @@
                 <w:sz w:val="20"/>
                 <w:szCs w:val="20"/>
               </w:rPr>
-              <w:t xml:space="preserve">2</w:t>
+              <w:t xml:space="preserve">3</w:t>
             </w:r>
           </w:p>
         </w:tc>
@@ -4461,7 +4479,7 @@
                 <w:sz w:val="20"/>
                 <w:szCs w:val="20"/>
               </w:rPr>
-              <w:t xml:space="preserve">1</w:t>
+              <w:t xml:space="preserve">0</w:t>
             </w:r>
           </w:p>
         </w:tc>
@@ -4565,7 +4583,7 @@
                 <w:sz w:val="20"/>
                 <w:szCs w:val="20"/>
               </w:rPr>
-              <w:t xml:space="preserve">147</w:t>
+              <w:t xml:space="preserve">149</w:t>
             </w:r>
           </w:p>
         </w:tc>
@@ -4591,7 +4609,7 @@
                 <w:sz w:val="20"/>
                 <w:szCs w:val="20"/>
               </w:rPr>
-              <w:t xml:space="preserve">11</w:t>
+              <w:t xml:space="preserve">13</w:t>
             </w:r>
           </w:p>
         </w:tc>
@@ -4617,7 +4635,7 @@
                 <w:sz w:val="20"/>
                 <w:szCs w:val="20"/>
               </w:rPr>
-              <w:t xml:space="preserve">2</w:t>
+              <w:t xml:space="preserve">3</w:t>
             </w:r>
           </w:p>
         </w:tc>
@@ -4643,7 +4661,7 @@
                 <w:sz w:val="20"/>
                 <w:szCs w:val="20"/>
               </w:rPr>
-              <w:t xml:space="preserve">5</w:t>
+              <w:t xml:space="preserve">0</w:t>
             </w:r>
           </w:p>
         </w:tc>
@@ -4669,7 +4687,7 @@
                 <w:sz w:val="20"/>
                 <w:szCs w:val="20"/>
               </w:rPr>
-              <w:t xml:space="preserve">89,1 %</w:t>
+              <w:t xml:space="preserve">90,3 %</w:t>
             </w:r>
           </w:p>
         </w:tc>
@@ -4727,7 +4745,7 @@
           <w:sz w:val="24"/>
           <w:szCs w:val="24"/>
         </w:rPr>
-        <w:t xml:space="preserve">De los 165 casos, 147 fueron aprobados, 11 fallidos, 2 bloqueados y 5 quedaron pendientes de revisión manual. El avance de ejecución fue de 95,8 % y la tasa de aprobación sobre los casos ejecutados, de 93,0 %. Los casos bloqueados dependen de condiciones externas a las pruebas: BD-07 requiere un equipo Windows con SQL Server Express o LocalDB y ENT-09 depende de la creación del TAG de entrega. Los pendientes son revisiones visuales y de redacción: comparación con Figma (MVC-GEN-03), tamaños de pantalla (MVC-GEN-04), navegadores (MVC-GEN-05), claridad de Swagger (SW-09) y formato del documento (ENT-12).</w:t>
+        <w:t xml:space="preserve">De los 165 casos, 149 fueron aprobados, 13 fallidos y 3 bloqueados. El avance de ejecución fue de 98,2 % y la tasa de aprobación sobre los casos ejecutados, de 92,0 %. Los casos bloqueados dependen de condiciones externas a las pruebas: BD-07 requiere un equipo Windows con SQL Server Express o LocalDB, ENT-09 depende de la creación del TAG de entrega y MVC-GEN-03 requiere acceso al diseño de Figma. No quedan casos pendientes de ejecución.</w:t>
       </w:r>
     </w:p>
     <w:p>
@@ -5068,7 +5086,7 @@
           <w:sz w:val="24"/>
           <w:szCs w:val="24"/>
         </w:rPr>
-        <w:t xml:space="preserve">Se registraron 8 defectos en la hoja Defectos: 2 de severidad media y 6 de severidad baja, sin defectos críticos ni altos. La Tabla X los resume; la matriz incluye los pasos para reproducirlos, el resultado esperado frente al obtenido, la evidencia y la corrección propuesta. El código del repositorio no se modificó.</w:t>
+        <w:t xml:space="preserve">Se registraron 11 defectos en la hoja Defectos: 2 de severidad media y 9 de severidad baja, sin defectos críticos ni altos. La Tabla X los resume; la matriz incluye los pasos para reproducirlos, el resultado esperado frente al obtenido, la evidencia y la corrección propuesta. El código del repositorio no se modificó.</w:t>
       </w:r>
     </w:p>
     <w:tbl>
@@ -6212,6 +6230,372 @@
           </w:p>
         </w:tc>
       </w:tr>
+      <w:tr>
+        <w:tc>
+          <w:tcPr>
+            <w:tcW w:w="850" w:type="dxa"/>
+          </w:tcPr>
+          <w:p>
+            <w:pPr>
+              <w:spacing w:before="40" w:after="40" w:line="240" w:lineRule="auto"/>
+              <w:jc w:val="left"/>
+              <w:rPr>
+                <w:rFonts w:ascii="Times New Roman" w:cs="Times New Roman" w:eastAsia="Times New Roman" w:hAnsi="Times New Roman"/>
+                <w:sz w:val="20"/>
+                <w:szCs w:val="20"/>
+              </w:rPr>
+            </w:pPr>
+            <w:r>
+              <w:rPr>
+                <w:rFonts w:ascii="Times New Roman" w:cs="Times New Roman" w:eastAsia="Times New Roman" w:hAnsi="Times New Roman"/>
+                <w:sz w:val="20"/>
+                <w:szCs w:val="20"/>
+              </w:rPr>
+              <w:t xml:space="preserve">DEF-09</w:t>
+            </w:r>
+          </w:p>
+        </w:tc>
+        <w:tc>
+          <w:tcPr>
+            <w:tcW w:w="1450" w:type="dxa"/>
+          </w:tcPr>
+          <w:p>
+            <w:pPr>
+              <w:spacing w:before="40" w:after="40" w:line="240" w:lineRule="auto"/>
+              <w:jc w:val="left"/>
+              <w:rPr>
+                <w:rFonts w:ascii="Times New Roman" w:cs="Times New Roman" w:eastAsia="Times New Roman" w:hAnsi="Times New Roman"/>
+                <w:sz w:val="20"/>
+                <w:szCs w:val="20"/>
+              </w:rPr>
+            </w:pPr>
+            <w:r>
+              <w:rPr>
+                <w:rFonts w:ascii="Times New Roman" w:cs="Times New Roman" w:eastAsia="Times New Roman" w:hAnsi="Times New Roman"/>
+                <w:sz w:val="20"/>
+                <w:szCs w:val="20"/>
+              </w:rPr>
+              <w:t xml:space="preserve">MVC-GEN-04</w:t>
+            </w:r>
+          </w:p>
+        </w:tc>
+        <w:tc>
+          <w:tcPr>
+            <w:tcW w:w="1050" w:type="dxa"/>
+          </w:tcPr>
+          <w:p>
+            <w:pPr>
+              <w:spacing w:before="40" w:after="40" w:line="240" w:lineRule="auto"/>
+              <w:jc w:val="center"/>
+              <w:rPr>
+                <w:rFonts w:ascii="Times New Roman" w:cs="Times New Roman" w:eastAsia="Times New Roman" w:hAnsi="Times New Roman"/>
+                <w:sz w:val="20"/>
+                <w:szCs w:val="20"/>
+              </w:rPr>
+            </w:pPr>
+            <w:r>
+              <w:rPr>
+                <w:rFonts w:ascii="Times New Roman" w:cs="Times New Roman" w:eastAsia="Times New Roman" w:hAnsi="Times New Roman"/>
+                <w:sz w:val="20"/>
+                <w:szCs w:val="20"/>
+              </w:rPr>
+              <w:t xml:space="preserve">Baja</w:t>
+            </w:r>
+          </w:p>
+        </w:tc>
+        <w:tc>
+          <w:tcPr>
+            <w:tcW w:w="3709" w:type="dxa"/>
+          </w:tcPr>
+          <w:p>
+            <w:pPr>
+              <w:spacing w:before="40" w:after="40" w:line="240" w:lineRule="auto"/>
+              <w:jc w:val="left"/>
+              <w:rPr>
+                <w:rFonts w:ascii="Times New Roman" w:cs="Times New Roman" w:eastAsia="Times New Roman" w:hAnsi="Times New Roman"/>
+                <w:sz w:val="20"/>
+                <w:szCs w:val="20"/>
+              </w:rPr>
+            </w:pPr>
+            <w:r>
+              <w:rPr>
+                <w:rFonts w:ascii="Times New Roman" w:cs="Times New Roman" w:eastAsia="Times New Roman" w:hAnsi="Times New Roman"/>
+                <w:sz w:val="20"/>
+                <w:szCs w:val="20"/>
+              </w:rPr>
+              <w:t xml:space="preserve">Los formularios de creación de personas y profesiones muestran un recuadro de error vacío.</w:t>
+            </w:r>
+          </w:p>
+        </w:tc>
+        <w:tc>
+          <w:tcPr>
+            <w:tcW w:w="1250" w:type="dxa"/>
+          </w:tcPr>
+          <w:p>
+            <w:pPr>
+              <w:spacing w:before="40" w:after="40" w:line="240" w:lineRule="auto"/>
+              <w:jc w:val="left"/>
+              <w:rPr>
+                <w:rFonts w:ascii="Times New Roman" w:cs="Times New Roman" w:eastAsia="Times New Roman" w:hAnsi="Times New Roman"/>
+                <w:sz w:val="20"/>
+                <w:szCs w:val="20"/>
+              </w:rPr>
+            </w:pPr>
+            <w:r>
+              <w:rPr>
+                <w:rFonts w:ascii="Times New Roman" w:cs="Times New Roman" w:eastAsia="Times New Roman" w:hAnsi="Times New Roman"/>
+                <w:sz w:val="20"/>
+                <w:szCs w:val="20"/>
+              </w:rPr>
+              <w:t xml:space="preserve">Andrés</w:t>
+            </w:r>
+          </w:p>
+        </w:tc>
+      </w:tr>
+      <w:tr>
+        <w:tc>
+          <w:tcPr>
+            <w:tcW w:w="850" w:type="dxa"/>
+          </w:tcPr>
+          <w:p>
+            <w:pPr>
+              <w:spacing w:before="40" w:after="40" w:line="240" w:lineRule="auto"/>
+              <w:jc w:val="left"/>
+              <w:rPr>
+                <w:rFonts w:ascii="Times New Roman" w:cs="Times New Roman" w:eastAsia="Times New Roman" w:hAnsi="Times New Roman"/>
+                <w:sz w:val="20"/>
+                <w:szCs w:val="20"/>
+              </w:rPr>
+            </w:pPr>
+            <w:r>
+              <w:rPr>
+                <w:rFonts w:ascii="Times New Roman" w:cs="Times New Roman" w:eastAsia="Times New Roman" w:hAnsi="Times New Roman"/>
+                <w:sz w:val="20"/>
+                <w:szCs w:val="20"/>
+              </w:rPr>
+              <w:t xml:space="preserve">DEF-10</w:t>
+            </w:r>
+          </w:p>
+        </w:tc>
+        <w:tc>
+          <w:tcPr>
+            <w:tcW w:w="1450" w:type="dxa"/>
+          </w:tcPr>
+          <w:p>
+            <w:pPr>
+              <w:spacing w:before="40" w:after="40" w:line="240" w:lineRule="auto"/>
+              <w:jc w:val="left"/>
+              <w:rPr>
+                <w:rFonts w:ascii="Times New Roman" w:cs="Times New Roman" w:eastAsia="Times New Roman" w:hAnsi="Times New Roman"/>
+                <w:sz w:val="20"/>
+                <w:szCs w:val="20"/>
+              </w:rPr>
+            </w:pPr>
+            <w:r>
+              <w:rPr>
+                <w:rFonts w:ascii="Times New Roman" w:cs="Times New Roman" w:eastAsia="Times New Roman" w:hAnsi="Times New Roman"/>
+                <w:sz w:val="20"/>
+                <w:szCs w:val="20"/>
+              </w:rPr>
+              <w:t xml:space="preserve">SW-09</w:t>
+            </w:r>
+          </w:p>
+        </w:tc>
+        <w:tc>
+          <w:tcPr>
+            <w:tcW w:w="1050" w:type="dxa"/>
+          </w:tcPr>
+          <w:p>
+            <w:pPr>
+              <w:spacing w:before="40" w:after="40" w:line="240" w:lineRule="auto"/>
+              <w:jc w:val="center"/>
+              <w:rPr>
+                <w:rFonts w:ascii="Times New Roman" w:cs="Times New Roman" w:eastAsia="Times New Roman" w:hAnsi="Times New Roman"/>
+                <w:sz w:val="20"/>
+                <w:szCs w:val="20"/>
+              </w:rPr>
+            </w:pPr>
+            <w:r>
+              <w:rPr>
+                <w:rFonts w:ascii="Times New Roman" w:cs="Times New Roman" w:eastAsia="Times New Roman" w:hAnsi="Times New Roman"/>
+                <w:sz w:val="20"/>
+                <w:szCs w:val="20"/>
+              </w:rPr>
+              <w:t xml:space="preserve">Baja</w:t>
+            </w:r>
+          </w:p>
+        </w:tc>
+        <w:tc>
+          <w:tcPr>
+            <w:tcW w:w="3709" w:type="dxa"/>
+          </w:tcPr>
+          <w:p>
+            <w:pPr>
+              <w:spacing w:before="40" w:after="40" w:line="240" w:lineRule="auto"/>
+              <w:jc w:val="left"/>
+              <w:rPr>
+                <w:rFonts w:ascii="Times New Roman" w:cs="Times New Roman" w:eastAsia="Times New Roman" w:hAnsi="Times New Roman"/>
+                <w:sz w:val="20"/>
+                <w:szCs w:val="20"/>
+              </w:rPr>
+            </w:pPr>
+            <w:r>
+              <w:rPr>
+                <w:rFonts w:ascii="Times New Roman" w:cs="Times New Roman" w:eastAsia="Times New Roman" w:hAnsi="Times New Roman"/>
+                <w:sz w:val="20"/>
+                <w:szCs w:val="20"/>
+              </w:rPr>
+              <w:t xml:space="preserve">Swagger no muestra resúmenes ni descripciones de operaciones y campos.</w:t>
+            </w:r>
+          </w:p>
+        </w:tc>
+        <w:tc>
+          <w:tcPr>
+            <w:tcW w:w="1250" w:type="dxa"/>
+          </w:tcPr>
+          <w:p>
+            <w:pPr>
+              <w:spacing w:before="40" w:after="40" w:line="240" w:lineRule="auto"/>
+              <w:jc w:val="left"/>
+              <w:rPr>
+                <w:rFonts w:ascii="Times New Roman" w:cs="Times New Roman" w:eastAsia="Times New Roman" w:hAnsi="Times New Roman"/>
+                <w:sz w:val="20"/>
+                <w:szCs w:val="20"/>
+              </w:rPr>
+            </w:pPr>
+            <w:r>
+              <w:rPr>
+                <w:rFonts w:ascii="Times New Roman" w:cs="Times New Roman" w:eastAsia="Times New Roman" w:hAnsi="Times New Roman"/>
+                <w:sz w:val="20"/>
+                <w:szCs w:val="20"/>
+              </w:rPr>
+              <w:t xml:space="preserve">Tomás</w:t>
+            </w:r>
+          </w:p>
+        </w:tc>
+      </w:tr>
+      <w:tr>
+        <w:tc>
+          <w:tcPr>
+            <w:tcW w:w="850" w:type="dxa"/>
+          </w:tcPr>
+          <w:p>
+            <w:pPr>
+              <w:spacing w:before="40" w:after="40" w:line="240" w:lineRule="auto"/>
+              <w:jc w:val="left"/>
+              <w:rPr>
+                <w:rFonts w:ascii="Times New Roman" w:cs="Times New Roman" w:eastAsia="Times New Roman" w:hAnsi="Times New Roman"/>
+                <w:sz w:val="20"/>
+                <w:szCs w:val="20"/>
+              </w:rPr>
+            </w:pPr>
+            <w:r>
+              <w:rPr>
+                <w:rFonts w:ascii="Times New Roman" w:cs="Times New Roman" w:eastAsia="Times New Roman" w:hAnsi="Times New Roman"/>
+                <w:sz w:val="20"/>
+                <w:szCs w:val="20"/>
+              </w:rPr>
+              <w:t xml:space="preserve">DEF-11</w:t>
+            </w:r>
+          </w:p>
+        </w:tc>
+        <w:tc>
+          <w:tcPr>
+            <w:tcW w:w="1450" w:type="dxa"/>
+          </w:tcPr>
+          <w:p>
+            <w:pPr>
+              <w:spacing w:before="40" w:after="40" w:line="240" w:lineRule="auto"/>
+              <w:jc w:val="left"/>
+              <w:rPr>
+                <w:rFonts w:ascii="Times New Roman" w:cs="Times New Roman" w:eastAsia="Times New Roman" w:hAnsi="Times New Roman"/>
+                <w:sz w:val="20"/>
+                <w:szCs w:val="20"/>
+              </w:rPr>
+            </w:pPr>
+            <w:r>
+              <w:rPr>
+                <w:rFonts w:ascii="Times New Roman" w:cs="Times New Roman" w:eastAsia="Times New Roman" w:hAnsi="Times New Roman"/>
+                <w:sz w:val="20"/>
+                <w:szCs w:val="20"/>
+              </w:rPr>
+              <w:t xml:space="preserve">ENT-12</w:t>
+            </w:r>
+          </w:p>
+        </w:tc>
+        <w:tc>
+          <w:tcPr>
+            <w:tcW w:w="1050" w:type="dxa"/>
+          </w:tcPr>
+          <w:p>
+            <w:pPr>
+              <w:spacing w:before="40" w:after="40" w:line="240" w:lineRule="auto"/>
+              <w:jc w:val="center"/>
+              <w:rPr>
+                <w:rFonts w:ascii="Times New Roman" w:cs="Times New Roman" w:eastAsia="Times New Roman" w:hAnsi="Times New Roman"/>
+                <w:sz w:val="20"/>
+                <w:szCs w:val="20"/>
+              </w:rPr>
+            </w:pPr>
+            <w:r>
+              <w:rPr>
+                <w:rFonts w:ascii="Times New Roman" w:cs="Times New Roman" w:eastAsia="Times New Roman" w:hAnsi="Times New Roman"/>
+                <w:sz w:val="20"/>
+                <w:szCs w:val="20"/>
+              </w:rPr>
+              <w:t xml:space="preserve">Baja</w:t>
+            </w:r>
+          </w:p>
+        </w:tc>
+        <w:tc>
+          <w:tcPr>
+            <w:tcW w:w="3709" w:type="dxa"/>
+          </w:tcPr>
+          <w:p>
+            <w:pPr>
+              <w:spacing w:before="40" w:after="40" w:line="240" w:lineRule="auto"/>
+              <w:jc w:val="left"/>
+              <w:rPr>
+                <w:rFonts w:ascii="Times New Roman" w:cs="Times New Roman" w:eastAsia="Times New Roman" w:hAnsi="Times New Roman"/>
+                <w:sz w:val="20"/>
+                <w:szCs w:val="20"/>
+              </w:rPr>
+            </w:pPr>
+            <w:r>
+              <w:rPr>
+                <w:rFonts w:ascii="Times New Roman" w:cs="Times New Roman" w:eastAsia="Times New Roman" w:hAnsi="Times New Roman"/>
+                <w:sz w:val="20"/>
+                <w:szCs w:val="20"/>
+              </w:rPr>
+              <w:t xml:space="preserve">El documento mezcla estilos, tiene errores de mayúsculas y referencias incompletas.</w:t>
+            </w:r>
+          </w:p>
+        </w:tc>
+        <w:tc>
+          <w:tcPr>
+            <w:tcW w:w="1250" w:type="dxa"/>
+          </w:tcPr>
+          <w:p>
+            <w:pPr>
+              <w:spacing w:before="40" w:after="40" w:line="240" w:lineRule="auto"/>
+              <w:jc w:val="left"/>
+              <w:rPr>
+                <w:rFonts w:ascii="Times New Roman" w:cs="Times New Roman" w:eastAsia="Times New Roman" w:hAnsi="Times New Roman"/>
+                <w:sz w:val="20"/>
+                <w:szCs w:val="20"/>
+              </w:rPr>
+            </w:pPr>
+            <w:r>
+              <w:rPr>
+                <w:rFonts w:ascii="Times New Roman" w:cs="Times New Roman" w:eastAsia="Times New Roman" w:hAnsi="Times New Roman"/>
+                <w:sz w:val="20"/>
+                <w:szCs w:val="20"/>
+              </w:rPr>
+              <w:t xml:space="preserve">Andrés</w:t>
+            </w:r>
+          </w:p>
+        </w:tc>
+      </w:tr>
     </w:tbl>
     <w:p>
       <w:pPr>
@@ -6326,7 +6710,7 @@
           <w:sz w:val="24"/>
           <w:szCs w:val="24"/>
         </w:rPr>
-        <w:t xml:space="preserve">Las pruebas de interfaz se ejecutaron en Chromium sin interfaz gráfica. Las pruebas en Edge y Firefox y la revisión visual en distintos tamaños de pantalla quedan para la revisión manual.</w:t>
+        <w:t xml:space="preserve">Chrome y Edge no estaban instalados en el equipo de pruebas. Las pruebas de interfaz usaron los motores de Playwright sin interfaz gráfica: Chromium (el de Chrome y Edge), Firefox y WebKit.</w:t>
       </w:r>
     </w:p>
     <w:p>
@@ -6368,7 +6752,7 @@
           <w:sz w:val="24"/>
           <w:szCs w:val="24"/>
         </w:rPr>
-        <w:t xml:space="preserve">La comparación con el diseño de Figma y la revisión de redacción del documento dependen de revisión manual.</w:t>
+        <w:t xml:space="preserve">No se tuvo acceso al diseño de Figma, por lo que la comparación de MVC-GEN-03 quedó bloqueada. Las revisiones de MVC-GEN-04, SW-09 y ENT-12 aplican criterios escritos en la matriz que el responsable de QA debe confirmar.</w:t>
       </w:r>
     </w:p>
     <w:p>
@@ -6405,7 +6789,7 @@
           <w:sz w:val="24"/>
           <w:szCs w:val="24"/>
         </w:rPr>
-        <w:t xml:space="preserve">La rama feature/frontend-mvc compila sin errores ni advertencias con el SDK 6.0.428, no modifica la API REST ni los scripts de base de datos y mantiene los resultados de main en la API, Swagger y el backend. En ella se aprobaron 31 de los 37 casos MVC ejecutados y los 8 casos de integración. Los defectos del frontend (DEF-06 y DEF-07) son de severidad baja y no impiden el uso de las operaciones CRUD.</w:t>
+        <w:t xml:space="preserve">La rama feature/frontend-mvc compila sin errores ni advertencias con el SDK 6.0.428, no modifica la API REST ni los scripts de base de datos y mantiene los resultados de main en la API, Swagger y el backend. En el frontend se aprobaron 33 de los 39 casos MVC ejecutados y los 8 casos de integración. Los defectos del frontend (DEF-06, DEF-07 y DEF-09) son de severidad baja y no impiden el uso de las operaciones CRUD.</w:t>
       </w:r>
     </w:p>
     <w:p>
@@ -6423,7 +6807,7 @@
           <w:sz w:val="24"/>
           <w:szCs w:val="24"/>
         </w:rPr>
-        <w:t xml:space="preserve">Por lo anterior, QA aprobó el Pull Request #2, que se integró en main el 27 de octubre de 2026 mediante el merge commit 8fc7d80. El caso ENT-07 se repitió sobre un clon limpio de main: la rama integrada compila sin errores ni advertencias y la aplicación responde correctamente en las vistas MVC, la API REST y Swagger. Antes de crear el TAG de entrega conviene corregir los defectos de severidad media DEF-01 y DEF-02, que corresponden al backend y al README, repetir ENT-08 y ENT-09 y completar los cinco casos manuales pendientes.</w:t>
+        <w:t xml:space="preserve">Por lo anterior, QA aprobó el Pull Request #2, que se integró en main el 27 de octubre de 2026 mediante el merge commit 8fc7d80. El caso ENT-07 se repitió sobre un clon limpio de main: la rama integrada compila sin errores ni advertencias y la aplicación responde correctamente en las vistas MVC, la API REST y Swagger. Antes de crear el TAG de entrega conviene corregir los defectos de severidad media DEF-01 y DEF-02, que corresponden al backend y al README, repetir ENT-08 y ENT-09 y completar la comparación con Figma (MVC-GEN-03) cuando el diseño esté disponible.</w:t>
       </w:r>
     </w:p>
     <w:p>

</xml_diff>

<commit_message>
test(qa): MVC-GEN-03 comparado con el diseño de Figma
El enlace compartido del diseño permitió comparar las 21 pantallas con
sus marcos. MVC-GEN-03 pasa de Bloqueado a Aprobado con las diferencias
registradas; DEF-07 anota que el diseño tampoco muestra la edad.
Matriz, sección 3.9 y README actualizados (150 aprobados, 2 bloqueados).
</commit_message>
<xml_diff>
--- a/QA/Laboratorio 1 — Implementación de Monolito con patrón MVC y DAO_QA.docx
+++ b/QA/Laboratorio 1 — Implementación de Monolito con patrón MVC y DAO_QA.docx
@@ -4067,7 +4067,7 @@
                 <w:sz w:val="20"/>
                 <w:szCs w:val="20"/>
               </w:rPr>
-              <w:t xml:space="preserve">33</w:t>
+              <w:t xml:space="preserve">34</w:t>
             </w:r>
           </w:p>
         </w:tc>
@@ -4115,7 +4115,7 @@
                 <w:sz w:val="20"/>
                 <w:szCs w:val="20"/>
               </w:rPr>
-              <w:t xml:space="preserve">1</w:t>
+              <w:t xml:space="preserve">0</w:t>
             </w:r>
           </w:p>
         </w:tc>
@@ -4163,7 +4163,7 @@
                 <w:sz w:val="20"/>
                 <w:szCs w:val="20"/>
               </w:rPr>
-              <w:t xml:space="preserve">82,5 %</w:t>
+              <w:t xml:space="preserve">85,0 %</w:t>
             </w:r>
           </w:p>
         </w:tc>
@@ -4583,7 +4583,7 @@
                 <w:sz w:val="20"/>
                 <w:szCs w:val="20"/>
               </w:rPr>
-              <w:t xml:space="preserve">149</w:t>
+              <w:t xml:space="preserve">150</w:t>
             </w:r>
           </w:p>
         </w:tc>
@@ -4635,7 +4635,7 @@
                 <w:sz w:val="20"/>
                 <w:szCs w:val="20"/>
               </w:rPr>
-              <w:t xml:space="preserve">3</w:t>
+              <w:t xml:space="preserve">2</w:t>
             </w:r>
           </w:p>
         </w:tc>
@@ -4687,7 +4687,7 @@
                 <w:sz w:val="20"/>
                 <w:szCs w:val="20"/>
               </w:rPr>
-              <w:t xml:space="preserve">90,3 %</w:t>
+              <w:t xml:space="preserve">90,9 %</w:t>
             </w:r>
           </w:p>
         </w:tc>
@@ -4745,7 +4745,7 @@
           <w:sz w:val="24"/>
           <w:szCs w:val="24"/>
         </w:rPr>
-        <w:t xml:space="preserve">De los 165 casos, 149 fueron aprobados, 13 fallidos y 3 bloqueados. El avance de ejecución fue de 98,2 % y la tasa de aprobación sobre los casos ejecutados, de 92,0 %. Los casos bloqueados dependen de condiciones externas a las pruebas: BD-07 requiere un equipo Windows con SQL Server Express o LocalDB, ENT-09 depende de la creación del TAG de entrega y MVC-GEN-03 requiere acceso al diseño de Figma. No quedan casos pendientes de ejecución.</w:t>
+        <w:t xml:space="preserve">De los 165 casos, 150 fueron aprobados, 13 fallidos y 2 bloqueados. El avance de ejecución fue de 98,8 % y la tasa de aprobación sobre los casos ejecutados, de 92,0 %. Los casos bloqueados dependen de condiciones externas a las pruebas: BD-07 requiere un equipo Windows con SQL Server Express o LocalDB y ENT-09 depende de la creación del TAG de entrega. No quedan casos pendientes de ejecución.</w:t>
       </w:r>
     </w:p>
     <w:p>
@@ -6752,7 +6752,7 @@
           <w:sz w:val="24"/>
           <w:szCs w:val="24"/>
         </w:rPr>
-        <w:t xml:space="preserve">No se tuvo acceso al diseño de Figma, por lo que la comparación de MVC-GEN-03 quedó bloqueada. Las revisiones de MVC-GEN-04, SW-09 y ENT-12 aplican criterios escritos en la matriz que el responsable de QA debe confirmar.</w:t>
+        <w:t xml:space="preserve">La comparación con el diseño de Figma (MVC-GEN-03) se hizo con el enlace compartido, sin sesión, a partir de capturas de cada marco. Las revisiones de MVC-GEN-03, MVC-GEN-04, SW-09 y ENT-12 aplican criterios escritos en la matriz que el responsable de QA debe confirmar.</w:t>
       </w:r>
     </w:p>
     <w:p>
@@ -6789,7 +6789,7 @@
           <w:sz w:val="24"/>
           <w:szCs w:val="24"/>
         </w:rPr>
-        <w:t xml:space="preserve">La rama feature/frontend-mvc compila sin errores ni advertencias con el SDK 6.0.428, no modifica la API REST ni los scripts de base de datos y mantiene los resultados de main en la API, Swagger y el backend. En el frontend se aprobaron 33 de los 39 casos MVC ejecutados y los 8 casos de integración. Los defectos del frontend (DEF-06, DEF-07 y DEF-09) son de severidad baja y no impiden el uso de las operaciones CRUD.</w:t>
+        <w:t xml:space="preserve">La rama feature/frontend-mvc compila sin errores ni advertencias con el SDK 6.0.428, no modifica la API REST ni los scripts de base de datos y mantiene los resultados de main en la API, Swagger y el backend. En el frontend se aprobaron 34 de los 40 casos MVC ejecutados y los 8 casos de integración. Los defectos del frontend (DEF-06, DEF-07 y DEF-09) son de severidad baja y no impiden el uso de las operaciones CRUD.</w:t>
       </w:r>
     </w:p>
     <w:p>
@@ -6807,7 +6807,7 @@
           <w:sz w:val="24"/>
           <w:szCs w:val="24"/>
         </w:rPr>
-        <w:t xml:space="preserve">Por lo anterior, QA aprobó el Pull Request #2, que se integró en main el 27 de octubre de 2026 mediante el merge commit 8fc7d80. El caso ENT-07 se repitió sobre un clon limpio de main: la rama integrada compila sin errores ni advertencias y la aplicación responde correctamente en las vistas MVC, la API REST y Swagger. Antes de crear el TAG de entrega conviene corregir los defectos de severidad media DEF-01 y DEF-02, que corresponden al backend y al README, repetir ENT-08 y ENT-09 y completar la comparación con Figma (MVC-GEN-03) cuando el diseño esté disponible.</w:t>
+        <w:t xml:space="preserve">Por lo anterior, QA aprobó el Pull Request #2, que se integró en main el 27 de octubre de 2026 mediante el merge commit 8fc7d80. El caso ENT-07 se repitió sobre un clon limpio de main: la rama integrada compila sin errores ni advertencias y la aplicación responde correctamente en las vistas MVC, la API REST y Swagger. Antes de crear el TAG de entrega conviene corregir los defectos de severidad media DEF-01 y DEF-02, que corresponden al backend y al README, repetir ENT-08 y ENT-09 y ejecutar BD-07 en un equipo Windows con SQL Server Express o LocalDB.</w:t>
       </w:r>
     </w:p>
     <w:p>

</xml_diff>

<commit_message>
test(qa): re-prueba ronda 1 de las correcciones del PR #7
Repite los casos de DEF-06, DEF-07 y DEF-09 sobre fix/def-06-07-09 (6a0edac)
y la suite completa como regresion. Agrega la seccion 3.9.7 al documento,
notas de re-prueba en la matriz (defectos en Verificado) y deja reservada
la ronda 2 de Tomas. La primera ejecucion se conserva sin cambios.
</commit_message>
<xml_diff>
--- a/QA/Laboratorio 1 — Implementación de Monolito con patrón MVC y DAO_QA.docx
+++ b/QA/Laboratorio 1 — Implementación de Monolito con patrón MVC y DAO_QA.docx
@@ -6808,6 +6808,607 @@
           <w:szCs w:val="24"/>
         </w:rPr>
         <w:t xml:space="preserve">Por lo anterior, QA aprobó el Pull Request #2, que se integró en main el 27 de octubre de 2026 mediante el merge commit 8fc7d80. El caso ENT-07 se repitió sobre un clon limpio de main: la rama integrada compila sin errores ni advertencias y la aplicación responde correctamente en las vistas MVC, la API REST y Swagger. Antes de crear el TAG de entrega conviene corregir los defectos de severidad media DEF-01 y DEF-02, que corresponden al backend y al README, repetir ENT-08 y ENT-09 y ejecutar BD-07 en un equipo Windows con SQL Server Express o LocalDB.</w:t>
+      </w:r>
+    </w:p>
+    <w:p>
+      <w:pPr>
+        <w:pStyle w:val="Heading3"/>
+        <w:keepNext/>
+        <w:rPr>
+          <w:rFonts w:ascii="Times New Roman" w:cs="Times New Roman" w:eastAsia="Times New Roman" w:hAnsi="Times New Roman"/>
+          <w:sz w:val="24"/>
+          <w:szCs w:val="24"/>
+        </w:rPr>
+      </w:pPr>
+      <w:r>
+        <w:rPr>
+          <w:rFonts w:ascii="Times New Roman" w:cs="Times New Roman" w:eastAsia="Times New Roman" w:hAnsi="Times New Roman"/>
+          <w:sz w:val="24"/>
+          <w:szCs w:val="24"/>
+        </w:rPr>
+        <w:t xml:space="preserve">3.9.7. Correcciones y re-pruebas</w:t>
+      </w:r>
+    </w:p>
+    <w:p>
+      <w:pPr>
+        <w:ind w:left="720" w:firstLine="0"/>
+        <w:rPr>
+          <w:rFonts w:ascii="Times New Roman" w:cs="Times New Roman" w:eastAsia="Times New Roman" w:hAnsi="Times New Roman"/>
+          <w:sz w:val="24"/>
+          <w:szCs w:val="24"/>
+        </w:rPr>
+      </w:pPr>
+      <w:r>
+        <w:rPr>
+          <w:rFonts w:ascii="Times New Roman" w:cs="Times New Roman" w:eastAsia="Times New Roman" w:hAnsi="Times New Roman"/>
+          <w:sz w:val="24"/>
+          <w:szCs w:val="24"/>
+        </w:rPr>
+        <w:t xml:space="preserve">Los resultados de las secciones 3.9.3 a 3.9.6 corresponden a la primera ejecución de la matriz y se conservan sin cambios. Después de esa ejecución, los responsables de cada defecto realizaron correcciones en rondas, y QA repitió los casos afectados y la suite completa como regresión. En la matriz, cada caso repetido conserva su estado original y suma una nota de re-prueba en Observaciones, y cada defecto verificado pasa al estado Verificado. Las evidencias de cada ronda están en QA/evidencias/reprueba/.</w:t>
+      </w:r>
+    </w:p>
+    <w:p>
+      <w:pPr>
+        <w:keepNext/>
+        <w:ind w:left="720" w:firstLine="0"/>
+        <w:rPr>
+          <w:rFonts w:ascii="Times New Roman" w:cs="Times New Roman" w:eastAsia="Times New Roman" w:hAnsi="Times New Roman"/>
+          <w:sz w:val="24"/>
+          <w:szCs w:val="24"/>
+        </w:rPr>
+      </w:pPr>
+      <w:r>
+        <w:rPr>
+          <w:rFonts w:ascii="Times New Roman" w:cs="Times New Roman" w:eastAsia="Times New Roman" w:hAnsi="Times New Roman"/>
+          <w:b/>
+          <w:sz w:val="24"/>
+          <w:szCs w:val="24"/>
+        </w:rPr>
+        <w:t xml:space="preserve">Ronda 1. Correcciones de Andrés Ortiz (Pull Request #7)</w:t>
+      </w:r>
+    </w:p>
+    <w:p>
+      <w:pPr>
+        <w:keepNext/>
+        <w:ind w:left="720" w:firstLine="0"/>
+        <w:rPr>
+          <w:rFonts w:ascii="Times New Roman" w:cs="Times New Roman" w:eastAsia="Times New Roman" w:hAnsi="Times New Roman"/>
+          <w:sz w:val="24"/>
+          <w:szCs w:val="24"/>
+        </w:rPr>
+      </w:pPr>
+      <w:r>
+        <w:rPr>
+          <w:rFonts w:ascii="Times New Roman" w:cs="Times New Roman" w:eastAsia="Times New Roman" w:hAnsi="Times New Roman"/>
+          <w:sz w:val="24"/>
+          <w:szCs w:val="24"/>
+        </w:rPr>
+        <w:t xml:space="preserve">Andrés Ortiz corrigió DEF-06, DEF-07 y DEF-09 en la rama fix/def-06-07-09 (commit 6a0edac). El 28 de octubre de 2026, QA repitió sobre esa rama la suite completa desde un contenedor limpio y los casos de revisión. Los 7 casos asociados a los defectos quedaron aprobados. Los demás casos mantuvieron su resultado, sin regresiones, y los scripts del equipo tests/mvc-defects.ps1 y tests/mvc-smoke.ps1 terminaron con 62 y 215 comprobaciones correctas. La Tabla X resume los cambios y su verificación.</w:t>
+      </w:r>
+    </w:p>
+    <w:tbl>
+      <w:tblPr>
+        <w:tblW w:w="8309" w:type="dxa"/>
+        <w:tblInd w:w="720" w:type="dxa"/>
+        <w:tblBorders>
+          <w:top w:val="single" w:sz="4" w:space="0" w:color="808080"/>
+          <w:left w:val="single" w:sz="4" w:space="0" w:color="808080"/>
+          <w:bottom w:val="single" w:sz="4" w:space="0" w:color="808080"/>
+          <w:right w:val="single" w:sz="4" w:space="0" w:color="808080"/>
+          <w:insideH w:val="single" w:sz="4" w:space="0" w:color="808080"/>
+          <w:insideV w:val="single" w:sz="4" w:space="0" w:color="808080"/>
+        </w:tblBorders>
+        <w:tblLayout w:type="fixed"/>
+        <w:tblCellMar>
+          <w:left w:w="80" w:type="dxa"/>
+          <w:right w:w="80" w:type="dxa"/>
+        </w:tblCellMar>
+      </w:tblPr>
+      <w:tblGrid>
+        <w:gridCol w:w="1000"/>
+        <w:gridCol w:w="3909"/>
+        <w:gridCol w:w="2000"/>
+        <w:gridCol w:w="1400"/>
+      </w:tblGrid>
+      <w:tr>
+        <w:trPr>
+          <w:tblHeader/>
+        </w:trPr>
+        <w:tc>
+          <w:tcPr>
+            <w:tcW w:w="1000" w:type="dxa"/>
+            <w:shd w:val="clear" w:color="auto" w:fill="D9D9D9"/>
+          </w:tcPr>
+          <w:p>
+            <w:pPr>
+              <w:spacing w:before="40" w:after="40" w:line="240" w:lineRule="auto"/>
+              <w:jc w:val="center"/>
+              <w:rPr>
+                <w:rFonts w:ascii="Times New Roman" w:cs="Times New Roman" w:eastAsia="Times New Roman" w:hAnsi="Times New Roman"/>
+                <w:b/>
+                <w:sz w:val="20"/>
+                <w:szCs w:val="20"/>
+              </w:rPr>
+            </w:pPr>
+            <w:r>
+              <w:rPr>
+                <w:rFonts w:ascii="Times New Roman" w:cs="Times New Roman" w:eastAsia="Times New Roman" w:hAnsi="Times New Roman"/>
+                <w:b/>
+                <w:sz w:val="20"/>
+                <w:szCs w:val="20"/>
+              </w:rPr>
+              <w:t xml:space="preserve">Defecto</w:t>
+            </w:r>
+          </w:p>
+        </w:tc>
+        <w:tc>
+          <w:tcPr>
+            <w:tcW w:w="3909" w:type="dxa"/>
+            <w:shd w:val="clear" w:color="auto" w:fill="D9D9D9"/>
+          </w:tcPr>
+          <w:p>
+            <w:pPr>
+              <w:spacing w:before="40" w:after="40" w:line="240" w:lineRule="auto"/>
+              <w:jc w:val="center"/>
+              <w:rPr>
+                <w:rFonts w:ascii="Times New Roman" w:cs="Times New Roman" w:eastAsia="Times New Roman" w:hAnsi="Times New Roman"/>
+                <w:b/>
+                <w:sz w:val="20"/>
+                <w:szCs w:val="20"/>
+              </w:rPr>
+            </w:pPr>
+            <w:r>
+              <w:rPr>
+                <w:rFonts w:ascii="Times New Roman" w:cs="Times New Roman" w:eastAsia="Times New Roman" w:hAnsi="Times New Roman"/>
+                <w:b/>
+                <w:sz w:val="20"/>
+                <w:szCs w:val="20"/>
+              </w:rPr>
+              <w:t xml:space="preserve">Corrección</w:t>
+            </w:r>
+          </w:p>
+        </w:tc>
+        <w:tc>
+          <w:tcPr>
+            <w:tcW w:w="2000" w:type="dxa"/>
+            <w:shd w:val="clear" w:color="auto" w:fill="D9D9D9"/>
+          </w:tcPr>
+          <w:p>
+            <w:pPr>
+              <w:spacing w:before="40" w:after="40" w:line="240" w:lineRule="auto"/>
+              <w:jc w:val="center"/>
+              <w:rPr>
+                <w:rFonts w:ascii="Times New Roman" w:cs="Times New Roman" w:eastAsia="Times New Roman" w:hAnsi="Times New Roman"/>
+                <w:b/>
+                <w:sz w:val="20"/>
+                <w:szCs w:val="20"/>
+              </w:rPr>
+            </w:pPr>
+            <w:r>
+              <w:rPr>
+                <w:rFonts w:ascii="Times New Roman" w:cs="Times New Roman" w:eastAsia="Times New Roman" w:hAnsi="Times New Roman"/>
+                <w:b/>
+                <w:sz w:val="20"/>
+                <w:szCs w:val="20"/>
+              </w:rPr>
+              <w:t xml:space="preserve">Casos repetidos</w:t>
+            </w:r>
+          </w:p>
+        </w:tc>
+        <w:tc>
+          <w:tcPr>
+            <w:tcW w:w="1400" w:type="dxa"/>
+            <w:shd w:val="clear" w:color="auto" w:fill="D9D9D9"/>
+          </w:tcPr>
+          <w:p>
+            <w:pPr>
+              <w:spacing w:before="40" w:after="40" w:line="240" w:lineRule="auto"/>
+              <w:jc w:val="center"/>
+              <w:rPr>
+                <w:rFonts w:ascii="Times New Roman" w:cs="Times New Roman" w:eastAsia="Times New Roman" w:hAnsi="Times New Roman"/>
+                <w:b/>
+                <w:sz w:val="20"/>
+                <w:szCs w:val="20"/>
+              </w:rPr>
+            </w:pPr>
+            <w:r>
+              <w:rPr>
+                <w:rFonts w:ascii="Times New Roman" w:cs="Times New Roman" w:eastAsia="Times New Roman" w:hAnsi="Times New Roman"/>
+                <w:b/>
+                <w:sz w:val="20"/>
+                <w:szCs w:val="20"/>
+              </w:rPr>
+              <w:t xml:space="preserve">Resultado</w:t>
+            </w:r>
+          </w:p>
+        </w:tc>
+      </w:tr>
+      <w:tr>
+        <w:tc>
+          <w:tcPr>
+            <w:tcW w:w="1000" w:type="dxa"/>
+          </w:tcPr>
+          <w:p>
+            <w:pPr>
+              <w:spacing w:before="40" w:after="40" w:line="240" w:lineRule="auto"/>
+              <w:jc w:val="left"/>
+              <w:rPr>
+                <w:rFonts w:ascii="Times New Roman" w:cs="Times New Roman" w:eastAsia="Times New Roman" w:hAnsi="Times New Roman"/>
+                <w:sz w:val="20"/>
+                <w:szCs w:val="20"/>
+              </w:rPr>
+            </w:pPr>
+            <w:r>
+              <w:rPr>
+                <w:rFonts w:ascii="Times New Roman" w:cs="Times New Roman" w:eastAsia="Times New Roman" w:hAnsi="Times New Roman"/>
+                <w:sz w:val="20"/>
+                <w:szCs w:val="20"/>
+              </w:rPr>
+              <w:t xml:space="preserve">DEF-06</w:t>
+            </w:r>
+          </w:p>
+        </w:tc>
+        <w:tc>
+          <w:tcPr>
+            <w:tcW w:w="3909" w:type="dxa"/>
+          </w:tcPr>
+          <w:p>
+            <w:pPr>
+              <w:spacing w:before="40" w:after="40" w:line="240" w:lineRule="auto"/>
+              <w:jc w:val="left"/>
+              <w:rPr>
+                <w:rFonts w:ascii="Times New Roman" w:cs="Times New Roman" w:eastAsia="Times New Roman" w:hAnsi="Times New Roman"/>
+                <w:sz w:val="20"/>
+                <w:szCs w:val="20"/>
+              </w:rPr>
+            </w:pPr>
+            <w:r>
+              <w:rPr>
+                <w:rFonts w:ascii="Times New Roman" w:cs="Times New Roman" w:eastAsia="Times New Roman" w:hAnsi="Times New Roman"/>
+                <w:sz w:val="20"/>
+                <w:szCs w:val="20"/>
+              </w:rPr>
+              <w:t xml:space="preserve">Página 404 propia con el layout y enlace al inicio (Program.cs, HomeController.cs, Views/Home/PageNotFound.cshtml); las rutas /api conservan su 404.</w:t>
+            </w:r>
+          </w:p>
+        </w:tc>
+        <w:tc>
+          <w:tcPr>
+            <w:tcW w:w="2000" w:type="dxa"/>
+          </w:tcPr>
+          <w:p>
+            <w:pPr>
+              <w:spacing w:before="40" w:after="40" w:line="240" w:lineRule="auto"/>
+              <w:jc w:val="left"/>
+              <w:rPr>
+                <w:rFonts w:ascii="Times New Roman" w:cs="Times New Roman" w:eastAsia="Times New Roman" w:hAnsi="Times New Roman"/>
+                <w:sz w:val="20"/>
+                <w:szCs w:val="20"/>
+              </w:rPr>
+            </w:pPr>
+            <w:r>
+              <w:rPr>
+                <w:rFonts w:ascii="Times New Roman" w:cs="Times New Roman" w:eastAsia="Times New Roman" w:hAnsi="Times New Roman"/>
+                <w:sz w:val="20"/>
+                <w:szCs w:val="20"/>
+              </w:rPr>
+              <w:t xml:space="preserve">MVC-PER-05, MVC-TEL-05, MVC-PRO-05, MVC-EST-05, MVC-GEN-07</w:t>
+            </w:r>
+          </w:p>
+        </w:tc>
+        <w:tc>
+          <w:tcPr>
+            <w:tcW w:w="1400" w:type="dxa"/>
+          </w:tcPr>
+          <w:p>
+            <w:pPr>
+              <w:spacing w:before="40" w:after="40" w:line="240" w:lineRule="auto"/>
+              <w:jc w:val="left"/>
+              <w:rPr>
+                <w:rFonts w:ascii="Times New Roman" w:cs="Times New Roman" w:eastAsia="Times New Roman" w:hAnsi="Times New Roman"/>
+                <w:sz w:val="20"/>
+                <w:szCs w:val="20"/>
+              </w:rPr>
+            </w:pPr>
+            <w:r>
+              <w:rPr>
+                <w:rFonts w:ascii="Times New Roman" w:cs="Times New Roman" w:eastAsia="Times New Roman" w:hAnsi="Times New Roman"/>
+                <w:sz w:val="20"/>
+                <w:szCs w:val="20"/>
+              </w:rPr>
+              <w:t xml:space="preserve">Aprobado; defecto verificado</w:t>
+            </w:r>
+          </w:p>
+        </w:tc>
+      </w:tr>
+      <w:tr>
+        <w:tc>
+          <w:tcPr>
+            <w:tcW w:w="1000" w:type="dxa"/>
+          </w:tcPr>
+          <w:p>
+            <w:pPr>
+              <w:spacing w:before="40" w:after="40" w:line="240" w:lineRule="auto"/>
+              <w:jc w:val="left"/>
+              <w:rPr>
+                <w:rFonts w:ascii="Times New Roman" w:cs="Times New Roman" w:eastAsia="Times New Roman" w:hAnsi="Times New Roman"/>
+                <w:sz w:val="20"/>
+                <w:szCs w:val="20"/>
+              </w:rPr>
+            </w:pPr>
+            <w:r>
+              <w:rPr>
+                <w:rFonts w:ascii="Times New Roman" w:cs="Times New Roman" w:eastAsia="Times New Roman" w:hAnsi="Times New Roman"/>
+                <w:sz w:val="20"/>
+                <w:szCs w:val="20"/>
+              </w:rPr>
+              <w:t xml:space="preserve">DEF-07</w:t>
+            </w:r>
+          </w:p>
+        </w:tc>
+        <w:tc>
+          <w:tcPr>
+            <w:tcW w:w="3909" w:type="dxa"/>
+          </w:tcPr>
+          <w:p>
+            <w:pPr>
+              <w:spacing w:before="40" w:after="40" w:line="240" w:lineRule="auto"/>
+              <w:jc w:val="left"/>
+              <w:rPr>
+                <w:rFonts w:ascii="Times New Roman" w:cs="Times New Roman" w:eastAsia="Times New Roman" w:hAnsi="Times New Roman"/>
+                <w:sz w:val="20"/>
+                <w:szCs w:val="20"/>
+              </w:rPr>
+            </w:pPr>
+            <w:r>
+              <w:rPr>
+                <w:rFonts w:ascii="Times New Roman" w:cs="Times New Roman" w:eastAsia="Times New Roman" w:hAnsi="Times New Roman"/>
+                <w:sz w:val="20"/>
+                <w:szCs w:val="20"/>
+              </w:rPr>
+              <w:t xml:space="preserve">Columna Edad en el listado de personas, con «—» para edades nulas.</w:t>
+            </w:r>
+          </w:p>
+        </w:tc>
+        <w:tc>
+          <w:tcPr>
+            <w:tcW w:w="2000" w:type="dxa"/>
+          </w:tcPr>
+          <w:p>
+            <w:pPr>
+              <w:spacing w:before="40" w:after="40" w:line="240" w:lineRule="auto"/>
+              <w:jc w:val="left"/>
+              <w:rPr>
+                <w:rFonts w:ascii="Times New Roman" w:cs="Times New Roman" w:eastAsia="Times New Roman" w:hAnsi="Times New Roman"/>
+                <w:sz w:val="20"/>
+                <w:szCs w:val="20"/>
+              </w:rPr>
+            </w:pPr>
+            <w:r>
+              <w:rPr>
+                <w:rFonts w:ascii="Times New Roman" w:cs="Times New Roman" w:eastAsia="Times New Roman" w:hAnsi="Times New Roman"/>
+                <w:sz w:val="20"/>
+                <w:szCs w:val="20"/>
+              </w:rPr>
+              <w:t xml:space="preserve">MVC-PER-01</w:t>
+            </w:r>
+          </w:p>
+        </w:tc>
+        <w:tc>
+          <w:tcPr>
+            <w:tcW w:w="1400" w:type="dxa"/>
+          </w:tcPr>
+          <w:p>
+            <w:pPr>
+              <w:spacing w:before="40" w:after="40" w:line="240" w:lineRule="auto"/>
+              <w:jc w:val="left"/>
+              <w:rPr>
+                <w:rFonts w:ascii="Times New Roman" w:cs="Times New Roman" w:eastAsia="Times New Roman" w:hAnsi="Times New Roman"/>
+                <w:sz w:val="20"/>
+                <w:szCs w:val="20"/>
+              </w:rPr>
+            </w:pPr>
+            <w:r>
+              <w:rPr>
+                <w:rFonts w:ascii="Times New Roman" w:cs="Times New Roman" w:eastAsia="Times New Roman" w:hAnsi="Times New Roman"/>
+                <w:sz w:val="20"/>
+                <w:szCs w:val="20"/>
+              </w:rPr>
+              <w:t xml:space="preserve">Aprobado; defecto verificado</w:t>
+            </w:r>
+          </w:p>
+        </w:tc>
+      </w:tr>
+      <w:tr>
+        <w:tc>
+          <w:tcPr>
+            <w:tcW w:w="1000" w:type="dxa"/>
+          </w:tcPr>
+          <w:p>
+            <w:pPr>
+              <w:spacing w:before="40" w:after="40" w:line="240" w:lineRule="auto"/>
+              <w:jc w:val="left"/>
+              <w:rPr>
+                <w:rFonts w:ascii="Times New Roman" w:cs="Times New Roman" w:eastAsia="Times New Roman" w:hAnsi="Times New Roman"/>
+                <w:sz w:val="20"/>
+                <w:szCs w:val="20"/>
+              </w:rPr>
+            </w:pPr>
+            <w:r>
+              <w:rPr>
+                <w:rFonts w:ascii="Times New Roman" w:cs="Times New Roman" w:eastAsia="Times New Roman" w:hAnsi="Times New Roman"/>
+                <w:sz w:val="20"/>
+                <w:szCs w:val="20"/>
+              </w:rPr>
+              <w:t xml:space="preserve">DEF-09</w:t>
+            </w:r>
+          </w:p>
+        </w:tc>
+        <w:tc>
+          <w:tcPr>
+            <w:tcW w:w="3909" w:type="dxa"/>
+          </w:tcPr>
+          <w:p>
+            <w:pPr>
+              <w:spacing w:before="40" w:after="40" w:line="240" w:lineRule="auto"/>
+              <w:jc w:val="left"/>
+              <w:rPr>
+                <w:rFonts w:ascii="Times New Roman" w:cs="Times New Roman" w:eastAsia="Times New Roman" w:hAnsi="Times New Roman"/>
+                <w:sz w:val="20"/>
+                <w:szCs w:val="20"/>
+              </w:rPr>
+            </w:pPr>
+            <w:r>
+              <w:rPr>
+                <w:rFonts w:ascii="Times New Roman" w:cs="Times New Roman" w:eastAsia="Times New Roman" w:hAnsi="Times New Roman"/>
+                <w:sz w:val="20"/>
+                <w:szCs w:val="20"/>
+              </w:rPr>
+              <w:t xml:space="preserve">Las claves vacías de los formularios de creación de personas y profesiones se marcan como válidas al abrirlos.</w:t>
+            </w:r>
+          </w:p>
+        </w:tc>
+        <w:tc>
+          <w:tcPr>
+            <w:tcW w:w="2000" w:type="dxa"/>
+          </w:tcPr>
+          <w:p>
+            <w:pPr>
+              <w:spacing w:before="40" w:after="40" w:line="240" w:lineRule="auto"/>
+              <w:jc w:val="left"/>
+              <w:rPr>
+                <w:rFonts w:ascii="Times New Roman" w:cs="Times New Roman" w:eastAsia="Times New Roman" w:hAnsi="Times New Roman"/>
+                <w:sz w:val="20"/>
+                <w:szCs w:val="20"/>
+              </w:rPr>
+            </w:pPr>
+            <w:r>
+              <w:rPr>
+                <w:rFonts w:ascii="Times New Roman" w:cs="Times New Roman" w:eastAsia="Times New Roman" w:hAnsi="Times New Roman"/>
+                <w:sz w:val="20"/>
+                <w:szCs w:val="20"/>
+              </w:rPr>
+              <w:t xml:space="preserve">MVC-GEN-04</w:t>
+            </w:r>
+          </w:p>
+        </w:tc>
+        <w:tc>
+          <w:tcPr>
+            <w:tcW w:w="1400" w:type="dxa"/>
+          </w:tcPr>
+          <w:p>
+            <w:pPr>
+              <w:spacing w:before="40" w:after="40" w:line="240" w:lineRule="auto"/>
+              <w:jc w:val="left"/>
+              <w:rPr>
+                <w:rFonts w:ascii="Times New Roman" w:cs="Times New Roman" w:eastAsia="Times New Roman" w:hAnsi="Times New Roman"/>
+                <w:sz w:val="20"/>
+                <w:szCs w:val="20"/>
+              </w:rPr>
+            </w:pPr>
+            <w:r>
+              <w:rPr>
+                <w:rFonts w:ascii="Times New Roman" w:cs="Times New Roman" w:eastAsia="Times New Roman" w:hAnsi="Times New Roman"/>
+                <w:sz w:val="20"/>
+                <w:szCs w:val="20"/>
+              </w:rPr>
+              <w:t xml:space="preserve">Aprobado; defecto verificado</w:t>
+            </w:r>
+          </w:p>
+        </w:tc>
+      </w:tr>
+    </w:tbl>
+    <w:p>
+      <w:pPr>
+        <w:rPr>
+          <w:rFonts w:ascii="Times New Roman" w:cs="Times New Roman" w:eastAsia="Times New Roman" w:hAnsi="Times New Roman"/>
+          <w:sz w:val="24"/>
+          <w:szCs w:val="24"/>
+        </w:rPr>
+      </w:pPr>
+      <w:r>
+        <w:rPr>
+          <w:rFonts w:ascii="Times New Roman" w:cs="Times New Roman" w:eastAsia="Times New Roman" w:hAnsi="Times New Roman"/>
+          <w:sz w:val="24"/>
+          <w:szCs w:val="24"/>
+        </w:rPr>
+        <w:t xml:space="preserve"/>
+      </w:r>
+    </w:p>
+    <w:p>
+      <w:pPr>
+        <w:spacing w:after="240"/>
+        <w:ind w:left="720" w:firstLine="0"/>
+        <w:jc w:val="center"/>
+        <w:rPr>
+          <w:rFonts w:ascii="Times New Roman" w:cs="Times New Roman" w:eastAsia="Times New Roman" w:hAnsi="Times New Roman"/>
+          <w:sz w:val="22"/>
+          <w:szCs w:val="22"/>
+        </w:rPr>
+      </w:pPr>
+      <w:r>
+        <w:rPr>
+          <w:rFonts w:ascii="Times New Roman" w:cs="Times New Roman" w:eastAsia="Times New Roman" w:hAnsi="Times New Roman"/>
+          <w:sz w:val="22"/>
+          <w:szCs w:val="22"/>
+        </w:rPr>
+        <w:t xml:space="preserve">Tabla X. Defectos corregidos en la ronda 1 y casos repetidos. Fuente: elaboración propia.</w:t>
+      </w:r>
+    </w:p>
+    <w:p>
+      <w:pPr>
+        <w:ind w:left="720" w:firstLine="0"/>
+        <w:rPr>
+          <w:rFonts w:ascii="Times New Roman" w:cs="Times New Roman" w:eastAsia="Times New Roman" w:hAnsi="Times New Roman"/>
+          <w:sz w:val="24"/>
+          <w:szCs w:val="24"/>
+        </w:rPr>
+      </w:pPr>
+      <w:r>
+        <w:rPr>
+          <w:rFonts w:ascii="Times New Roman" w:cs="Times New Roman" w:eastAsia="Times New Roman" w:hAnsi="Times New Roman"/>
+          <w:sz w:val="24"/>
+          <w:szCs w:val="24"/>
+        </w:rPr>
+        <w:t xml:space="preserve">Por lo anterior, QA aprobó el Pull Request #7. Los defectos del documento asignados al mismo responsable (DEF-08 y DEF-11) siguen abiertos.</w:t>
+      </w:r>
+    </w:p>
+    <w:p>
+      <w:pPr>
+        <w:keepNext/>
+        <w:ind w:left="720" w:firstLine="0"/>
+        <w:rPr>
+          <w:rFonts w:ascii="Times New Roman" w:cs="Times New Roman" w:eastAsia="Times New Roman" w:hAnsi="Times New Roman"/>
+          <w:sz w:val="24"/>
+          <w:szCs w:val="24"/>
+        </w:rPr>
+      </w:pPr>
+      <w:r>
+        <w:rPr>
+          <w:rFonts w:ascii="Times New Roman" w:cs="Times New Roman" w:eastAsia="Times New Roman" w:hAnsi="Times New Roman"/>
+          <w:b/>
+          <w:sz w:val="24"/>
+          <w:szCs w:val="24"/>
+        </w:rPr>
+        <w:t xml:space="preserve">Ronda 2. Correcciones de Tomás Ramírez</w:t>
+      </w:r>
+    </w:p>
+    <w:p>
+      <w:pPr>
+        <w:ind w:left="720" w:firstLine="0"/>
+        <w:rPr>
+          <w:rFonts w:ascii="Times New Roman" w:cs="Times New Roman" w:eastAsia="Times New Roman" w:hAnsi="Times New Roman"/>
+          <w:sz w:val="24"/>
+          <w:szCs w:val="24"/>
+        </w:rPr>
+      </w:pPr>
+      <w:r>
+        <w:rPr>
+          <w:rFonts w:ascii="Times New Roman" w:cs="Times New Roman" w:eastAsia="Times New Roman" w:hAnsi="Times New Roman"/>
+          <w:sz w:val="24"/>
+          <w:szCs w:val="24"/>
+        </w:rPr>
+        <w:t xml:space="preserve">Pendiente. Esta ronda corresponde a los defectos asignados a Tomás Ramírez (DEF-01, DEF-02, DEF-03, DEF-04, DEF-05 y DEF-10). Se completará cuando se integren sus correcciones y QA repita los casos afectados.</w:t>
       </w:r>
     </w:p>
     <w:p>

</xml_diff>

<commit_message>
test(qa): re-prueba ronda 2 de las correcciones de Tomas (PR #9, #10, #11)
Repite sobre main integrada (a05612c) los casos de DEF-01, DEF-02, DEF-03,
DEF-04, DEF-05 y DEF-10 y la suite completa como regresion. Completa la
ronda 2 en la seccion 3.9.7, la matriz (DEF-05 en Corregido, los demas en
Verificado) y el README de QA. Ajusta los scripts que tenian textos fijos
de la primera ejecucion o comparaban con la rama ya integrada del PR #2.
</commit_message>
<xml_diff>
--- a/QA/Laboratorio 1 — Implementación de Monolito con patrón MVC y DAO_QA.docx
+++ b/QA/Laboratorio 1 — Implementación de Monolito con patrón MVC y DAO_QA.docx
@@ -6844,7 +6844,7 @@
           <w:sz w:val="24"/>
           <w:szCs w:val="24"/>
         </w:rPr>
-        <w:t xml:space="preserve">Los resultados de las secciones 3.9.3 a 3.9.6 corresponden a la primera ejecución de la matriz y se conservan sin cambios. Después de esa ejecución, los responsables de cada defecto realizaron correcciones en rondas, y QA repitió los casos afectados y la suite completa como regresión. En la matriz, cada caso repetido conserva su estado original y suma una nota de re-prueba en Observaciones, y cada defecto verificado pasa al estado Verificado. Las evidencias de cada ronda están en QA/evidencias/reprueba/.</w:t>
+        <w:t xml:space="preserve">Los resultados de las secciones 3.9.3 a 3.9.6 corresponden a la primera ejecución de la matriz y se conservan sin cambios. Después de esa ejecución, los responsables de cada defecto realizaron correcciones en rondas, y QA repitió los casos afectados y la suite completa como regresión. En la matriz, cada caso repetido conserva su estado original y suma una nota de re-prueba en Observaciones, y cada defecto pasa al estado Verificado o, si la re-prueba no cubre todos los entornos, Corregido. Las evidencias de cada ronda están en QA/evidencias/reprueba/.</w:t>
       </w:r>
     </w:p>
     <w:p>
@@ -6883,7 +6883,7 @@
           <w:sz w:val="24"/>
           <w:szCs w:val="24"/>
         </w:rPr>
-        <w:t xml:space="preserve">Andrés Ortiz corrigió DEF-06, DEF-07 y DEF-09 en la rama fix/def-06-07-09 (commit 6a0edac). El 28 de octubre de 2026, QA repitió sobre esa rama la suite completa desde un contenedor limpio y los casos de revisión. Los 7 casos asociados a los defectos quedaron aprobados. Los demás casos mantuvieron su resultado, sin regresiones, y los scripts del equipo tests/mvc-defects.ps1 y tests/mvc-smoke.ps1 terminaron con 62 y 215 comprobaciones correctas. La Tabla X resume los cambios y su verificación.</w:t>
+        <w:t xml:space="preserve">Andrés Ortiz corrigió DEF-06, DEF-07 y DEF-09 en la rama fix/def-06-07-09 (commit 6a0edac). El 28 de octubre de 2026, QA repitió sobre esa rama la suite completa desde un contenedor limpio y los casos de revisión. De los 7 casos asociados a los defectos, 7 quedaron aprobados. Los demás casos mantuvieron su resultado, sin regresiones, y los scripts del equipo tests/mvc-defects.ps1 y tests/mvc-smoke.ps1 terminaron con 62 y 215 comprobaciones correctas. La Tabla X resume los cambios y su verificación.</w:t>
       </w:r>
     </w:p>
     <w:tbl>
@@ -7390,11 +7390,12 @@
           <w:sz w:val="24"/>
           <w:szCs w:val="24"/>
         </w:rPr>
-        <w:t xml:space="preserve">Ronda 2. Correcciones de Tomás Ramírez</w:t>
-      </w:r>
-    </w:p>
-    <w:p>
-      <w:pPr>
+        <w:t xml:space="preserve">Ronda 2. Correcciones de Tomás Ramírez (Pull Request #9, #10 y #11)</w:t>
+      </w:r>
+    </w:p>
+    <w:p>
+      <w:pPr>
+        <w:keepNext/>
         <w:ind w:left="720" w:firstLine="0"/>
         <w:rPr>
           <w:rFonts w:ascii="Times New Roman" w:cs="Times New Roman" w:eastAsia="Times New Roman" w:hAnsi="Times New Roman"/>
@@ -7408,7 +7409,788 @@
           <w:sz w:val="24"/>
           <w:szCs w:val="24"/>
         </w:rPr>
-        <w:t xml:space="preserve">Pendiente. Esta ronda corresponde a los defectos asignados a Tomás Ramírez (DEF-01, DEF-02, DEF-03, DEF-04, DEF-05 y DEF-10). Se completará cuando se integren sus correcciones y QA repita los casos afectados.</w:t>
+        <w:t xml:space="preserve">Tomás Ramírez corrigió DEF-01, DEF-02, DEF-03, DEF-04, DEF-05 y DEF-10 en tres Pull Request que se integraron en main antes de la revisión de QA. El 28 de octubre de 2026, QA repitió sobre main integrada (merge commit a05612c) la suite completa desde un contenedor limpio y los casos de revisión. De los 7 casos asociados a los defectos, 6 quedaron aprobados; BD-07 quedó bloqueado. Los demás casos mantuvieron su resultado, sin regresiones, y los scripts del equipo terminaron con 62 y 215 comprobaciones correctas. Como prueba adicional de DEF-03, con SQL Server detenido, ocho operaciones de lectura y escritura de la API respondieron 503 sin traza. La Tabla X resume los cambios y su verificación.</w:t>
+      </w:r>
+    </w:p>
+    <w:tbl>
+      <w:tblPr>
+        <w:tblW w:w="8309" w:type="dxa"/>
+        <w:tblInd w:w="720" w:type="dxa"/>
+        <w:tblBorders>
+          <w:top w:val="single" w:sz="4" w:space="0" w:color="808080"/>
+          <w:left w:val="single" w:sz="4" w:space="0" w:color="808080"/>
+          <w:bottom w:val="single" w:sz="4" w:space="0" w:color="808080"/>
+          <w:right w:val="single" w:sz="4" w:space="0" w:color="808080"/>
+          <w:insideH w:val="single" w:sz="4" w:space="0" w:color="808080"/>
+          <w:insideV w:val="single" w:sz="4" w:space="0" w:color="808080"/>
+        </w:tblBorders>
+        <w:tblLayout w:type="fixed"/>
+        <w:tblCellMar>
+          <w:left w:w="80" w:type="dxa"/>
+          <w:right w:w="80" w:type="dxa"/>
+        </w:tblCellMar>
+      </w:tblPr>
+      <w:tblGrid>
+        <w:gridCol w:w="1000"/>
+        <w:gridCol w:w="3909"/>
+        <w:gridCol w:w="2000"/>
+        <w:gridCol w:w="1400"/>
+      </w:tblGrid>
+      <w:tr>
+        <w:trPr>
+          <w:tblHeader/>
+        </w:trPr>
+        <w:tc>
+          <w:tcPr>
+            <w:tcW w:w="1000" w:type="dxa"/>
+            <w:shd w:val="clear" w:color="auto" w:fill="D9D9D9"/>
+          </w:tcPr>
+          <w:p>
+            <w:pPr>
+              <w:spacing w:before="40" w:after="40" w:line="240" w:lineRule="auto"/>
+              <w:jc w:val="center"/>
+              <w:rPr>
+                <w:rFonts w:ascii="Times New Roman" w:cs="Times New Roman" w:eastAsia="Times New Roman" w:hAnsi="Times New Roman"/>
+                <w:b/>
+                <w:sz w:val="20"/>
+                <w:szCs w:val="20"/>
+              </w:rPr>
+            </w:pPr>
+            <w:r>
+              <w:rPr>
+                <w:rFonts w:ascii="Times New Roman" w:cs="Times New Roman" w:eastAsia="Times New Roman" w:hAnsi="Times New Roman"/>
+                <w:b/>
+                <w:sz w:val="20"/>
+                <w:szCs w:val="20"/>
+              </w:rPr>
+              <w:t xml:space="preserve">Defecto</w:t>
+            </w:r>
+          </w:p>
+        </w:tc>
+        <w:tc>
+          <w:tcPr>
+            <w:tcW w:w="3909" w:type="dxa"/>
+            <w:shd w:val="clear" w:color="auto" w:fill="D9D9D9"/>
+          </w:tcPr>
+          <w:p>
+            <w:pPr>
+              <w:spacing w:before="40" w:after="40" w:line="240" w:lineRule="auto"/>
+              <w:jc w:val="center"/>
+              <w:rPr>
+                <w:rFonts w:ascii="Times New Roman" w:cs="Times New Roman" w:eastAsia="Times New Roman" w:hAnsi="Times New Roman"/>
+                <w:b/>
+                <w:sz w:val="20"/>
+                <w:szCs w:val="20"/>
+              </w:rPr>
+            </w:pPr>
+            <w:r>
+              <w:rPr>
+                <w:rFonts w:ascii="Times New Roman" w:cs="Times New Roman" w:eastAsia="Times New Roman" w:hAnsi="Times New Roman"/>
+                <w:b/>
+                <w:sz w:val="20"/>
+                <w:szCs w:val="20"/>
+              </w:rPr>
+              <w:t xml:space="preserve">Corrección</w:t>
+            </w:r>
+          </w:p>
+        </w:tc>
+        <w:tc>
+          <w:tcPr>
+            <w:tcW w:w="2000" w:type="dxa"/>
+            <w:shd w:val="clear" w:color="auto" w:fill="D9D9D9"/>
+          </w:tcPr>
+          <w:p>
+            <w:pPr>
+              <w:spacing w:before="40" w:after="40" w:line="240" w:lineRule="auto"/>
+              <w:jc w:val="center"/>
+              <w:rPr>
+                <w:rFonts w:ascii="Times New Roman" w:cs="Times New Roman" w:eastAsia="Times New Roman" w:hAnsi="Times New Roman"/>
+                <w:b/>
+                <w:sz w:val="20"/>
+                <w:szCs w:val="20"/>
+              </w:rPr>
+            </w:pPr>
+            <w:r>
+              <w:rPr>
+                <w:rFonts w:ascii="Times New Roman" w:cs="Times New Roman" w:eastAsia="Times New Roman" w:hAnsi="Times New Roman"/>
+                <w:b/>
+                <w:sz w:val="20"/>
+                <w:szCs w:val="20"/>
+              </w:rPr>
+              <w:t xml:space="preserve">Casos repetidos</w:t>
+            </w:r>
+          </w:p>
+        </w:tc>
+        <w:tc>
+          <w:tcPr>
+            <w:tcW w:w="1400" w:type="dxa"/>
+            <w:shd w:val="clear" w:color="auto" w:fill="D9D9D9"/>
+          </w:tcPr>
+          <w:p>
+            <w:pPr>
+              <w:spacing w:before="40" w:after="40" w:line="240" w:lineRule="auto"/>
+              <w:jc w:val="center"/>
+              <w:rPr>
+                <w:rFonts w:ascii="Times New Roman" w:cs="Times New Roman" w:eastAsia="Times New Roman" w:hAnsi="Times New Roman"/>
+                <w:b/>
+                <w:sz w:val="20"/>
+                <w:szCs w:val="20"/>
+              </w:rPr>
+            </w:pPr>
+            <w:r>
+              <w:rPr>
+                <w:rFonts w:ascii="Times New Roman" w:cs="Times New Roman" w:eastAsia="Times New Roman" w:hAnsi="Times New Roman"/>
+                <w:b/>
+                <w:sz w:val="20"/>
+                <w:szCs w:val="20"/>
+              </w:rPr>
+              <w:t xml:space="preserve">Resultado</w:t>
+            </w:r>
+          </w:p>
+        </w:tc>
+      </w:tr>
+      <w:tr>
+        <w:tc>
+          <w:tcPr>
+            <w:tcW w:w="1000" w:type="dxa"/>
+          </w:tcPr>
+          <w:p>
+            <w:pPr>
+              <w:spacing w:before="40" w:after="40" w:line="240" w:lineRule="auto"/>
+              <w:jc w:val="left"/>
+              <w:rPr>
+                <w:rFonts w:ascii="Times New Roman" w:cs="Times New Roman" w:eastAsia="Times New Roman" w:hAnsi="Times New Roman"/>
+                <w:sz w:val="20"/>
+                <w:szCs w:val="20"/>
+              </w:rPr>
+            </w:pPr>
+            <w:r>
+              <w:rPr>
+                <w:rFonts w:ascii="Times New Roman" w:cs="Times New Roman" w:eastAsia="Times New Roman" w:hAnsi="Times New Roman"/>
+                <w:sz w:val="20"/>
+                <w:szCs w:val="20"/>
+              </w:rPr>
+              <w:t xml:space="preserve">DEF-01</w:t>
+            </w:r>
+          </w:p>
+        </w:tc>
+        <w:tc>
+          <w:tcPr>
+            <w:tcW w:w="3909" w:type="dxa"/>
+          </w:tcPr>
+          <w:p>
+            <w:pPr>
+              <w:spacing w:before="40" w:after="40" w:line="240" w:lineRule="auto"/>
+              <w:jc w:val="left"/>
+              <w:rPr>
+                <w:rFonts w:ascii="Times New Roman" w:cs="Times New Roman" w:eastAsia="Times New Roman" w:hAnsi="Times New Roman"/>
+                <w:sz w:val="20"/>
+                <w:szCs w:val="20"/>
+              </w:rPr>
+            </w:pPr>
+            <w:r>
+              <w:rPr>
+                <w:rFonts w:ascii="Times New Roman" w:cs="Times New Roman" w:eastAsia="Times New Roman" w:hAnsi="Times New Roman"/>
+                <w:sz w:val="20"/>
+                <w:szCs w:val="20"/>
+              </w:rPr>
+              <w:t xml:space="preserve">Los POST de la API capturan la clave duplicada de SQL Server (errores 2601 y 2627) y responden 409 (Pull Request #9).</w:t>
+            </w:r>
+          </w:p>
+        </w:tc>
+        <w:tc>
+          <w:tcPr>
+            <w:tcW w:w="2000" w:type="dxa"/>
+          </w:tcPr>
+          <w:p>
+            <w:pPr>
+              <w:spacing w:before="40" w:after="40" w:line="240" w:lineRule="auto"/>
+              <w:jc w:val="left"/>
+              <w:rPr>
+                <w:rFonts w:ascii="Times New Roman" w:cs="Times New Roman" w:eastAsia="Times New Roman" w:hAnsi="Times New Roman"/>
+                <w:sz w:val="20"/>
+                <w:szCs w:val="20"/>
+              </w:rPr>
+            </w:pPr>
+            <w:r>
+              <w:rPr>
+                <w:rFonts w:ascii="Times New Roman" w:cs="Times New Roman" w:eastAsia="Times New Roman" w:hAnsi="Times New Roman"/>
+                <w:sz w:val="20"/>
+                <w:szCs w:val="20"/>
+              </w:rPr>
+              <w:t xml:space="preserve">API-GEN-05</w:t>
+            </w:r>
+          </w:p>
+        </w:tc>
+        <w:tc>
+          <w:tcPr>
+            <w:tcW w:w="1400" w:type="dxa"/>
+          </w:tcPr>
+          <w:p>
+            <w:pPr>
+              <w:spacing w:before="40" w:after="40" w:line="240" w:lineRule="auto"/>
+              <w:jc w:val="left"/>
+              <w:rPr>
+                <w:rFonts w:ascii="Times New Roman" w:cs="Times New Roman" w:eastAsia="Times New Roman" w:hAnsi="Times New Roman"/>
+                <w:sz w:val="20"/>
+                <w:szCs w:val="20"/>
+              </w:rPr>
+            </w:pPr>
+            <w:r>
+              <w:rPr>
+                <w:rFonts w:ascii="Times New Roman" w:cs="Times New Roman" w:eastAsia="Times New Roman" w:hAnsi="Times New Roman"/>
+                <w:sz w:val="20"/>
+                <w:szCs w:val="20"/>
+              </w:rPr>
+              <w:t xml:space="preserve">Aprobado; defecto verificado</w:t>
+            </w:r>
+          </w:p>
+        </w:tc>
+      </w:tr>
+      <w:tr>
+        <w:tc>
+          <w:tcPr>
+            <w:tcW w:w="1000" w:type="dxa"/>
+          </w:tcPr>
+          <w:p>
+            <w:pPr>
+              <w:spacing w:before="40" w:after="40" w:line="240" w:lineRule="auto"/>
+              <w:jc w:val="left"/>
+              <w:rPr>
+                <w:rFonts w:ascii="Times New Roman" w:cs="Times New Roman" w:eastAsia="Times New Roman" w:hAnsi="Times New Roman"/>
+                <w:sz w:val="20"/>
+                <w:szCs w:val="20"/>
+              </w:rPr>
+            </w:pPr>
+            <w:r>
+              <w:rPr>
+                <w:rFonts w:ascii="Times New Roman" w:cs="Times New Roman" w:eastAsia="Times New Roman" w:hAnsi="Times New Roman"/>
+                <w:sz w:val="20"/>
+                <w:szCs w:val="20"/>
+              </w:rPr>
+              <w:t xml:space="preserve">DEF-02</w:t>
+            </w:r>
+          </w:p>
+        </w:tc>
+        <w:tc>
+          <w:tcPr>
+            <w:tcW w:w="3909" w:type="dxa"/>
+          </w:tcPr>
+          <w:p>
+            <w:pPr>
+              <w:spacing w:before="40" w:after="40" w:line="240" w:lineRule="auto"/>
+              <w:jc w:val="left"/>
+              <w:rPr>
+                <w:rFonts w:ascii="Times New Roman" w:cs="Times New Roman" w:eastAsia="Times New Roman" w:hAnsi="Times New Roman"/>
+                <w:sz w:val="20"/>
+                <w:szCs w:val="20"/>
+              </w:rPr>
+            </w:pPr>
+            <w:r>
+              <w:rPr>
+                <w:rFonts w:ascii="Times New Roman" w:cs="Times New Roman" w:eastAsia="Times New Roman" w:hAnsi="Times New Roman"/>
+                <w:sz w:val="20"/>
+                <w:szCs w:val="20"/>
+              </w:rPr>
+              <w:t xml:space="preserve">El README ejecuta la aplicación publicada desde la carpeta publish/ (Pull Request #9).</w:t>
+            </w:r>
+          </w:p>
+        </w:tc>
+        <w:tc>
+          <w:tcPr>
+            <w:tcW w:w="2000" w:type="dxa"/>
+          </w:tcPr>
+          <w:p>
+            <w:pPr>
+              <w:spacing w:before="40" w:after="40" w:line="240" w:lineRule="auto"/>
+              <w:jc w:val="left"/>
+              <w:rPr>
+                <w:rFonts w:ascii="Times New Roman" w:cs="Times New Roman" w:eastAsia="Times New Roman" w:hAnsi="Times New Roman"/>
+                <w:sz w:val="20"/>
+                <w:szCs w:val="20"/>
+              </w:rPr>
+            </w:pPr>
+            <w:r>
+              <w:rPr>
+                <w:rFonts w:ascii="Times New Roman" w:cs="Times New Roman" w:eastAsia="Times New Roman" w:hAnsi="Times New Roman"/>
+                <w:sz w:val="20"/>
+                <w:szCs w:val="20"/>
+              </w:rPr>
+              <w:t xml:space="preserve">ENT-08</w:t>
+            </w:r>
+          </w:p>
+        </w:tc>
+        <w:tc>
+          <w:tcPr>
+            <w:tcW w:w="1400" w:type="dxa"/>
+          </w:tcPr>
+          <w:p>
+            <w:pPr>
+              <w:spacing w:before="40" w:after="40" w:line="240" w:lineRule="auto"/>
+              <w:jc w:val="left"/>
+              <w:rPr>
+                <w:rFonts w:ascii="Times New Roman" w:cs="Times New Roman" w:eastAsia="Times New Roman" w:hAnsi="Times New Roman"/>
+                <w:sz w:val="20"/>
+                <w:szCs w:val="20"/>
+              </w:rPr>
+            </w:pPr>
+            <w:r>
+              <w:rPr>
+                <w:rFonts w:ascii="Times New Roman" w:cs="Times New Roman" w:eastAsia="Times New Roman" w:hAnsi="Times New Roman"/>
+                <w:sz w:val="20"/>
+                <w:szCs w:val="20"/>
+              </w:rPr>
+              <w:t xml:space="preserve">Aprobado; defecto verificado</w:t>
+            </w:r>
+          </w:p>
+        </w:tc>
+      </w:tr>
+      <w:tr>
+        <w:tc>
+          <w:tcPr>
+            <w:tcW w:w="1000" w:type="dxa"/>
+          </w:tcPr>
+          <w:p>
+            <w:pPr>
+              <w:spacing w:before="40" w:after="40" w:line="240" w:lineRule="auto"/>
+              <w:jc w:val="left"/>
+              <w:rPr>
+                <w:rFonts w:ascii="Times New Roman" w:cs="Times New Roman" w:eastAsia="Times New Roman" w:hAnsi="Times New Roman"/>
+                <w:sz w:val="20"/>
+                <w:szCs w:val="20"/>
+              </w:rPr>
+            </w:pPr>
+            <w:r>
+              <w:rPr>
+                <w:rFonts w:ascii="Times New Roman" w:cs="Times New Roman" w:eastAsia="Times New Roman" w:hAnsi="Times New Roman"/>
+                <w:sz w:val="20"/>
+                <w:szCs w:val="20"/>
+              </w:rPr>
+              <w:t xml:space="preserve">DEF-03</w:t>
+            </w:r>
+          </w:p>
+        </w:tc>
+        <w:tc>
+          <w:tcPr>
+            <w:tcW w:w="3909" w:type="dxa"/>
+          </w:tcPr>
+          <w:p>
+            <w:pPr>
+              <w:spacing w:before="40" w:after="40" w:line="240" w:lineRule="auto"/>
+              <w:jc w:val="left"/>
+              <w:rPr>
+                <w:rFonts w:ascii="Times New Roman" w:cs="Times New Roman" w:eastAsia="Times New Roman" w:hAnsi="Times New Roman"/>
+                <w:sz w:val="20"/>
+                <w:szCs w:val="20"/>
+              </w:rPr>
+            </w:pPr>
+            <w:r>
+              <w:rPr>
+                <w:rFonts w:ascii="Times New Roman" w:cs="Times New Roman" w:eastAsia="Times New Roman" w:hAnsi="Times New Roman"/>
+                <w:sz w:val="20"/>
+                <w:szCs w:val="20"/>
+              </w:rPr>
+              <w:t xml:space="preserve">Middleware para /api que responde 503 con ProblemDetails, sin traza, ante SqlException (Pull Request #10).</w:t>
+            </w:r>
+          </w:p>
+        </w:tc>
+        <w:tc>
+          <w:tcPr>
+            <w:tcW w:w="2000" w:type="dxa"/>
+          </w:tcPr>
+          <w:p>
+            <w:pPr>
+              <w:spacing w:before="40" w:after="40" w:line="240" w:lineRule="auto"/>
+              <w:jc w:val="left"/>
+              <w:rPr>
+                <w:rFonts w:ascii="Times New Roman" w:cs="Times New Roman" w:eastAsia="Times New Roman" w:hAnsi="Times New Roman"/>
+                <w:sz w:val="20"/>
+                <w:szCs w:val="20"/>
+              </w:rPr>
+            </w:pPr>
+            <w:r>
+              <w:rPr>
+                <w:rFonts w:ascii="Times New Roman" w:cs="Times New Roman" w:eastAsia="Times New Roman" w:hAnsi="Times New Roman"/>
+                <w:sz w:val="20"/>
+                <w:szCs w:val="20"/>
+              </w:rPr>
+              <w:t xml:space="preserve">BK-09, INT-08</w:t>
+            </w:r>
+          </w:p>
+        </w:tc>
+        <w:tc>
+          <w:tcPr>
+            <w:tcW w:w="1400" w:type="dxa"/>
+          </w:tcPr>
+          <w:p>
+            <w:pPr>
+              <w:spacing w:before="40" w:after="40" w:line="240" w:lineRule="auto"/>
+              <w:jc w:val="left"/>
+              <w:rPr>
+                <w:rFonts w:ascii="Times New Roman" w:cs="Times New Roman" w:eastAsia="Times New Roman" w:hAnsi="Times New Roman"/>
+                <w:sz w:val="20"/>
+                <w:szCs w:val="20"/>
+              </w:rPr>
+            </w:pPr>
+            <w:r>
+              <w:rPr>
+                <w:rFonts w:ascii="Times New Roman" w:cs="Times New Roman" w:eastAsia="Times New Roman" w:hAnsi="Times New Roman"/>
+                <w:sz w:val="20"/>
+                <w:szCs w:val="20"/>
+              </w:rPr>
+              <w:t xml:space="preserve">Aprobado; defecto verificado</w:t>
+            </w:r>
+          </w:p>
+        </w:tc>
+      </w:tr>
+      <w:tr>
+        <w:tc>
+          <w:tcPr>
+            <w:tcW w:w="1000" w:type="dxa"/>
+          </w:tcPr>
+          <w:p>
+            <w:pPr>
+              <w:spacing w:before="40" w:after="40" w:line="240" w:lineRule="auto"/>
+              <w:jc w:val="left"/>
+              <w:rPr>
+                <w:rFonts w:ascii="Times New Roman" w:cs="Times New Roman" w:eastAsia="Times New Roman" w:hAnsi="Times New Roman"/>
+                <w:sz w:val="20"/>
+                <w:szCs w:val="20"/>
+              </w:rPr>
+            </w:pPr>
+            <w:r>
+              <w:rPr>
+                <w:rFonts w:ascii="Times New Roman" w:cs="Times New Roman" w:eastAsia="Times New Roman" w:hAnsi="Times New Roman"/>
+                <w:sz w:val="20"/>
+                <w:szCs w:val="20"/>
+              </w:rPr>
+              <w:t xml:space="preserve">DEF-04</w:t>
+            </w:r>
+          </w:p>
+        </w:tc>
+        <w:tc>
+          <w:tcPr>
+            <w:tcW w:w="3909" w:type="dxa"/>
+          </w:tcPr>
+          <w:p>
+            <w:pPr>
+              <w:spacing w:before="40" w:after="40" w:line="240" w:lineRule="auto"/>
+              <w:jc w:val="left"/>
+              <w:rPr>
+                <w:rFonts w:ascii="Times New Roman" w:cs="Times New Roman" w:eastAsia="Times New Roman" w:hAnsi="Times New Roman"/>
+                <w:sz w:val="20"/>
+                <w:szCs w:val="20"/>
+              </w:rPr>
+            </w:pPr>
+            <w:r>
+              <w:rPr>
+                <w:rFonts w:ascii="Times New Roman" w:cs="Times New Roman" w:eastAsia="Times New Roman" w:hAnsi="Times New Roman"/>
+                <w:sz w:val="20"/>
+                <w:szCs w:val="20"/>
+              </w:rPr>
+              <w:t xml:space="preserve">Advertencia en el README y en el encabezado del DDL de que el script borra los datos (Pull Request #10).</w:t>
+            </w:r>
+          </w:p>
+        </w:tc>
+        <w:tc>
+          <w:tcPr>
+            <w:tcW w:w="2000" w:type="dxa"/>
+          </w:tcPr>
+          <w:p>
+            <w:pPr>
+              <w:spacing w:before="40" w:after="40" w:line="240" w:lineRule="auto"/>
+              <w:jc w:val="left"/>
+              <w:rPr>
+                <w:rFonts w:ascii="Times New Roman" w:cs="Times New Roman" w:eastAsia="Times New Roman" w:hAnsi="Times New Roman"/>
+                <w:sz w:val="20"/>
+                <w:szCs w:val="20"/>
+              </w:rPr>
+            </w:pPr>
+            <w:r>
+              <w:rPr>
+                <w:rFonts w:ascii="Times New Roman" w:cs="Times New Roman" w:eastAsia="Times New Roman" w:hAnsi="Times New Roman"/>
+                <w:sz w:val="20"/>
+                <w:szCs w:val="20"/>
+              </w:rPr>
+              <w:t xml:space="preserve">BD-08</w:t>
+            </w:r>
+          </w:p>
+        </w:tc>
+        <w:tc>
+          <w:tcPr>
+            <w:tcW w:w="1400" w:type="dxa"/>
+          </w:tcPr>
+          <w:p>
+            <w:pPr>
+              <w:spacing w:before="40" w:after="40" w:line="240" w:lineRule="auto"/>
+              <w:jc w:val="left"/>
+              <w:rPr>
+                <w:rFonts w:ascii="Times New Roman" w:cs="Times New Roman" w:eastAsia="Times New Roman" w:hAnsi="Times New Roman"/>
+                <w:sz w:val="20"/>
+                <w:szCs w:val="20"/>
+              </w:rPr>
+            </w:pPr>
+            <w:r>
+              <w:rPr>
+                <w:rFonts w:ascii="Times New Roman" w:cs="Times New Roman" w:eastAsia="Times New Roman" w:hAnsi="Times New Roman"/>
+                <w:sz w:val="20"/>
+                <w:szCs w:val="20"/>
+              </w:rPr>
+              <w:t xml:space="preserve">Aprobado; defecto verificado</w:t>
+            </w:r>
+          </w:p>
+        </w:tc>
+      </w:tr>
+      <w:tr>
+        <w:tc>
+          <w:tcPr>
+            <w:tcW w:w="1000" w:type="dxa"/>
+          </w:tcPr>
+          <w:p>
+            <w:pPr>
+              <w:spacing w:before="40" w:after="40" w:line="240" w:lineRule="auto"/>
+              <w:jc w:val="left"/>
+              <w:rPr>
+                <w:rFonts w:ascii="Times New Roman" w:cs="Times New Roman" w:eastAsia="Times New Roman" w:hAnsi="Times New Roman"/>
+                <w:sz w:val="20"/>
+                <w:szCs w:val="20"/>
+              </w:rPr>
+            </w:pPr>
+            <w:r>
+              <w:rPr>
+                <w:rFonts w:ascii="Times New Roman" w:cs="Times New Roman" w:eastAsia="Times New Roman" w:hAnsi="Times New Roman"/>
+                <w:sz w:val="20"/>
+                <w:szCs w:val="20"/>
+              </w:rPr>
+              <w:t xml:space="preserve">DEF-05</w:t>
+            </w:r>
+          </w:p>
+        </w:tc>
+        <w:tc>
+          <w:tcPr>
+            <w:tcW w:w="3909" w:type="dxa"/>
+          </w:tcPr>
+          <w:p>
+            <w:pPr>
+              <w:spacing w:before="40" w:after="40" w:line="240" w:lineRule="auto"/>
+              <w:jc w:val="left"/>
+              <w:rPr>
+                <w:rFonts w:ascii="Times New Roman" w:cs="Times New Roman" w:eastAsia="Times New Roman" w:hAnsi="Times New Roman"/>
+                <w:sz w:val="20"/>
+                <w:szCs w:val="20"/>
+              </w:rPr>
+            </w:pPr>
+            <w:r>
+              <w:rPr>
+                <w:rFonts w:ascii="Times New Roman" w:cs="Times New Roman" w:eastAsia="Times New Roman" w:hAnsi="Times New Roman"/>
+                <w:sz w:val="20"/>
+                <w:szCs w:val="20"/>
+              </w:rPr>
+              <w:t xml:space="preserve">ALTER AUTHORIZATION dentro de TRY/CATCH con aviso y opción C del README para LocalDB (Pull Request #11).</w:t>
+            </w:r>
+          </w:p>
+        </w:tc>
+        <w:tc>
+          <w:tcPr>
+            <w:tcW w:w="2000" w:type="dxa"/>
+          </w:tcPr>
+          <w:p>
+            <w:pPr>
+              <w:spacing w:before="40" w:after="40" w:line="240" w:lineRule="auto"/>
+              <w:jc w:val="left"/>
+              <w:rPr>
+                <w:rFonts w:ascii="Times New Roman" w:cs="Times New Roman" w:eastAsia="Times New Roman" w:hAnsi="Times New Roman"/>
+                <w:sz w:val="20"/>
+                <w:szCs w:val="20"/>
+              </w:rPr>
+            </w:pPr>
+            <w:r>
+              <w:rPr>
+                <w:rFonts w:ascii="Times New Roman" w:cs="Times New Roman" w:eastAsia="Times New Roman" w:hAnsi="Times New Roman"/>
+                <w:sz w:val="20"/>
+                <w:szCs w:val="20"/>
+              </w:rPr>
+              <w:t xml:space="preserve">BD-07</w:t>
+            </w:r>
+          </w:p>
+        </w:tc>
+        <w:tc>
+          <w:tcPr>
+            <w:tcW w:w="1400" w:type="dxa"/>
+          </w:tcPr>
+          <w:p>
+            <w:pPr>
+              <w:spacing w:before="40" w:after="40" w:line="240" w:lineRule="auto"/>
+              <w:jc w:val="left"/>
+              <w:rPr>
+                <w:rFonts w:ascii="Times New Roman" w:cs="Times New Roman" w:eastAsia="Times New Roman" w:hAnsi="Times New Roman"/>
+                <w:sz w:val="20"/>
+                <w:szCs w:val="20"/>
+              </w:rPr>
+            </w:pPr>
+            <w:r>
+              <w:rPr>
+                <w:rFonts w:ascii="Times New Roman" w:cs="Times New Roman" w:eastAsia="Times New Roman" w:hAnsi="Times New Roman"/>
+                <w:sz w:val="20"/>
+                <w:szCs w:val="20"/>
+              </w:rPr>
+              <w:t xml:space="preserve">Bloqueado; defecto corregido</w:t>
+            </w:r>
+          </w:p>
+        </w:tc>
+      </w:tr>
+      <w:tr>
+        <w:tc>
+          <w:tcPr>
+            <w:tcW w:w="1000" w:type="dxa"/>
+          </w:tcPr>
+          <w:p>
+            <w:pPr>
+              <w:spacing w:before="40" w:after="40" w:line="240" w:lineRule="auto"/>
+              <w:jc w:val="left"/>
+              <w:rPr>
+                <w:rFonts w:ascii="Times New Roman" w:cs="Times New Roman" w:eastAsia="Times New Roman" w:hAnsi="Times New Roman"/>
+                <w:sz w:val="20"/>
+                <w:szCs w:val="20"/>
+              </w:rPr>
+            </w:pPr>
+            <w:r>
+              <w:rPr>
+                <w:rFonts w:ascii="Times New Roman" w:cs="Times New Roman" w:eastAsia="Times New Roman" w:hAnsi="Times New Roman"/>
+                <w:sz w:val="20"/>
+                <w:szCs w:val="20"/>
+              </w:rPr>
+              <w:t xml:space="preserve">DEF-10</w:t>
+            </w:r>
+          </w:p>
+        </w:tc>
+        <w:tc>
+          <w:tcPr>
+            <w:tcW w:w="3909" w:type="dxa"/>
+          </w:tcPr>
+          <w:p>
+            <w:pPr>
+              <w:spacing w:before="40" w:after="40" w:line="240" w:lineRule="auto"/>
+              <w:jc w:val="left"/>
+              <w:rPr>
+                <w:rFonts w:ascii="Times New Roman" w:cs="Times New Roman" w:eastAsia="Times New Roman" w:hAnsi="Times New Roman"/>
+                <w:sz w:val="20"/>
+                <w:szCs w:val="20"/>
+              </w:rPr>
+            </w:pPr>
+            <w:r>
+              <w:rPr>
+                <w:rFonts w:ascii="Times New Roman" w:cs="Times New Roman" w:eastAsia="Times New Roman" w:hAnsi="Times New Roman"/>
+                <w:sz w:val="20"/>
+                <w:szCs w:val="20"/>
+              </w:rPr>
+              <w:t xml:space="preserve">Comentarios XML en controladores y DTO y archivo de documentación incluido en Swagger (Pull Request #11).</w:t>
+            </w:r>
+          </w:p>
+        </w:tc>
+        <w:tc>
+          <w:tcPr>
+            <w:tcW w:w="2000" w:type="dxa"/>
+          </w:tcPr>
+          <w:p>
+            <w:pPr>
+              <w:spacing w:before="40" w:after="40" w:line="240" w:lineRule="auto"/>
+              <w:jc w:val="left"/>
+              <w:rPr>
+                <w:rFonts w:ascii="Times New Roman" w:cs="Times New Roman" w:eastAsia="Times New Roman" w:hAnsi="Times New Roman"/>
+                <w:sz w:val="20"/>
+                <w:szCs w:val="20"/>
+              </w:rPr>
+            </w:pPr>
+            <w:r>
+              <w:rPr>
+                <w:rFonts w:ascii="Times New Roman" w:cs="Times New Roman" w:eastAsia="Times New Roman" w:hAnsi="Times New Roman"/>
+                <w:sz w:val="20"/>
+                <w:szCs w:val="20"/>
+              </w:rPr>
+              <w:t xml:space="preserve">SW-09</w:t>
+            </w:r>
+          </w:p>
+        </w:tc>
+        <w:tc>
+          <w:tcPr>
+            <w:tcW w:w="1400" w:type="dxa"/>
+          </w:tcPr>
+          <w:p>
+            <w:pPr>
+              <w:spacing w:before="40" w:after="40" w:line="240" w:lineRule="auto"/>
+              <w:jc w:val="left"/>
+              <w:rPr>
+                <w:rFonts w:ascii="Times New Roman" w:cs="Times New Roman" w:eastAsia="Times New Roman" w:hAnsi="Times New Roman"/>
+                <w:sz w:val="20"/>
+                <w:szCs w:val="20"/>
+              </w:rPr>
+            </w:pPr>
+            <w:r>
+              <w:rPr>
+                <w:rFonts w:ascii="Times New Roman" w:cs="Times New Roman" w:eastAsia="Times New Roman" w:hAnsi="Times New Roman"/>
+                <w:sz w:val="20"/>
+                <w:szCs w:val="20"/>
+              </w:rPr>
+              <w:t xml:space="preserve">Aprobado; defecto verificado</w:t>
+            </w:r>
+          </w:p>
+        </w:tc>
+      </w:tr>
+    </w:tbl>
+    <w:p>
+      <w:pPr>
+        <w:rPr>
+          <w:rFonts w:ascii="Times New Roman" w:cs="Times New Roman" w:eastAsia="Times New Roman" w:hAnsi="Times New Roman"/>
+          <w:sz w:val="24"/>
+          <w:szCs w:val="24"/>
+        </w:rPr>
+      </w:pPr>
+      <w:r>
+        <w:rPr>
+          <w:rFonts w:ascii="Times New Roman" w:cs="Times New Roman" w:eastAsia="Times New Roman" w:hAnsi="Times New Roman"/>
+          <w:sz w:val="24"/>
+          <w:szCs w:val="24"/>
+        </w:rPr>
+        <w:t xml:space="preserve"/>
+      </w:r>
+    </w:p>
+    <w:p>
+      <w:pPr>
+        <w:spacing w:after="240"/>
+        <w:ind w:left="720" w:firstLine="0"/>
+        <w:jc w:val="center"/>
+        <w:rPr>
+          <w:rFonts w:ascii="Times New Roman" w:cs="Times New Roman" w:eastAsia="Times New Roman" w:hAnsi="Times New Roman"/>
+          <w:sz w:val="22"/>
+          <w:szCs w:val="22"/>
+        </w:rPr>
+      </w:pPr>
+      <w:r>
+        <w:rPr>
+          <w:rFonts w:ascii="Times New Roman" w:cs="Times New Roman" w:eastAsia="Times New Roman" w:hAnsi="Times New Roman"/>
+          <w:sz w:val="22"/>
+          <w:szCs w:val="22"/>
+        </w:rPr>
+        <w:t xml:space="preserve">Tabla X. Defectos corregidos en la ronda 2 y casos repetidos. Fuente: elaboración propia.</w:t>
+      </w:r>
+    </w:p>
+    <w:p>
+      <w:pPr>
+        <w:ind w:left="720" w:firstLine="0"/>
+        <w:rPr>
+          <w:rFonts w:ascii="Times New Roman" w:cs="Times New Roman" w:eastAsia="Times New Roman" w:hAnsi="Times New Roman"/>
+          <w:sz w:val="24"/>
+          <w:szCs w:val="24"/>
+        </w:rPr>
+      </w:pPr>
+      <w:r>
+        <w:rPr>
+          <w:rFonts w:ascii="Times New Roman" w:cs="Times New Roman" w:eastAsia="Times New Roman" w:hAnsi="Times New Roman"/>
+          <w:sz w:val="24"/>
+          <w:szCs w:val="24"/>
+        </w:rPr>
+        <w:t xml:space="preserve">Por lo anterior, QA aprueba las correcciones de los Pull Request #9, #10 y #11. DEF-05 queda en estado Corregido: con un login sin rol sysadmin el DDL termina sin error y muestra el aviso, pero BD-07 sigue bloqueado hasta ejecutarlo en Windows con SQL Server Express o LocalDB.</w:t>
       </w:r>
     </w:p>
     <w:p>

</xml_diff>

<commit_message>
test(qa): DEF-12 y re-prueba ronda 3 (PR #13)
Registra DEF-12 (falta Microsoft.EntityFrameworkCore.Tools, exigido por el
enunciado) y amplia BK-01 a los tres paquetes del procedimiento: falla en
6d26734 y pasa en f68b6a5. Agrega la ronda 3 a la seccion 3.9.7, la matriz
y el README de QA. La seccion 3.9.4 conserva los 11 defectos de la primera
ejecucion y la matriz usa la fecha de deteccion de cada defecto.
</commit_message>
<xml_diff>
--- a/QA/Laboratorio 1 — Implementación de Monolito con patrón MVC y DAO_QA.docx
+++ b/QA/Laboratorio 1 — Implementación de Monolito con patrón MVC y DAO_QA.docx
@@ -8191,6 +8191,355 @@
           <w:szCs w:val="24"/>
         </w:rPr>
         <w:t xml:space="preserve">Por lo anterior, QA aprueba las correcciones de los Pull Request #9, #10 y #11. DEF-05 queda en estado Corregido: con un login sin rol sysadmin el DDL termina sin error y muestra el aviso, pero BD-07 sigue bloqueado hasta ejecutarlo en Windows con SQL Server Express o LocalDB.</w:t>
+      </w:r>
+    </w:p>
+    <w:p>
+      <w:pPr>
+        <w:keepNext/>
+        <w:ind w:left="720" w:firstLine="0"/>
+        <w:rPr>
+          <w:rFonts w:ascii="Times New Roman" w:cs="Times New Roman" w:eastAsia="Times New Roman" w:hAnsi="Times New Roman"/>
+          <w:sz w:val="24"/>
+          <w:szCs w:val="24"/>
+        </w:rPr>
+      </w:pPr>
+      <w:r>
+        <w:rPr>
+          <w:rFonts w:ascii="Times New Roman" w:cs="Times New Roman" w:eastAsia="Times New Roman" w:hAnsi="Times New Roman"/>
+          <w:b/>
+          <w:sz w:val="24"/>
+          <w:szCs w:val="24"/>
+        </w:rPr>
+        <w:t xml:space="preserve">Ronda 3. Correcciones de Tomás Ramírez (Pull Request #13)</w:t>
+      </w:r>
+    </w:p>
+    <w:p>
+      <w:pPr>
+        <w:keepNext/>
+        <w:ind w:left="720" w:firstLine="0"/>
+        <w:rPr>
+          <w:rFonts w:ascii="Times New Roman" w:cs="Times New Roman" w:eastAsia="Times New Roman" w:hAnsi="Times New Roman"/>
+          <w:sz w:val="24"/>
+          <w:szCs w:val="24"/>
+        </w:rPr>
+      </w:pPr>
+      <w:r>
+        <w:rPr>
+          <w:rFonts w:ascii="Times New Roman" w:cs="Times New Roman" w:eastAsia="Times New Roman" w:hAnsi="Times New Roman"/>
+          <w:sz w:val="24"/>
+          <w:szCs w:val="24"/>
+        </w:rPr>
+        <w:t xml:space="preserve">Después de la ronda 2, QA contrastó el repositorio con el enunciado oficial del laboratorio y registró DEF-12: el procedimiento exige el paquete Microsoft.EntityFrameworkCore.Tools y el proyecto no lo incluía. En la primera ejecución BK-01 se había aprobado con un criterio que no lo exigía; desde esta ronda BK-01 verifica los tres paquetes que pide el enunciado.</w:t>
+      </w:r>
+    </w:p>
+    <w:p>
+      <w:pPr>
+        <w:keepNext/>
+        <w:ind w:left="720" w:firstLine="0"/>
+        <w:rPr>
+          <w:rFonts w:ascii="Times New Roman" w:cs="Times New Roman" w:eastAsia="Times New Roman" w:hAnsi="Times New Roman"/>
+          <w:sz w:val="24"/>
+          <w:szCs w:val="24"/>
+        </w:rPr>
+      </w:pPr>
+      <w:r>
+        <w:rPr>
+          <w:rFonts w:ascii="Times New Roman" w:cs="Times New Roman" w:eastAsia="Times New Roman" w:hAnsi="Times New Roman"/>
+          <w:sz w:val="24"/>
+          <w:szCs w:val="24"/>
+        </w:rPr>
+        <w:t xml:space="preserve">Tomás Ramírez corrigió DEF-12 en el Pull Request #13 (commit 1aba298). El 29 de octubre de 2026, QA repitió sobre la rama del Pull Request la suite completa desde un contenedor limpio y los casos de revisión. El caso asociado, BK-01, quedó aprobado. La compilación desde una copia limpia terminó con 0 advertencias y 0 errores, y dotnet ef dbcontext scaffold generó las 4 entidades idénticas a las del repositorio. Los demás casos mantuvieron su resultado, sin regresiones, y los scripts del equipo terminaron con 62 y 215 comprobaciones correctas. La Tabla X resume los cambios y su verificación.</w:t>
+      </w:r>
+    </w:p>
+    <w:tbl>
+      <w:tblPr>
+        <w:tblW w:w="8309" w:type="dxa"/>
+        <w:tblInd w:w="720" w:type="dxa"/>
+        <w:tblBorders>
+          <w:top w:val="single" w:sz="4" w:space="0" w:color="808080"/>
+          <w:left w:val="single" w:sz="4" w:space="0" w:color="808080"/>
+          <w:bottom w:val="single" w:sz="4" w:space="0" w:color="808080"/>
+          <w:right w:val="single" w:sz="4" w:space="0" w:color="808080"/>
+          <w:insideH w:val="single" w:sz="4" w:space="0" w:color="808080"/>
+          <w:insideV w:val="single" w:sz="4" w:space="0" w:color="808080"/>
+        </w:tblBorders>
+        <w:tblLayout w:type="fixed"/>
+        <w:tblCellMar>
+          <w:left w:w="80" w:type="dxa"/>
+          <w:right w:w="80" w:type="dxa"/>
+        </w:tblCellMar>
+      </w:tblPr>
+      <w:tblGrid>
+        <w:gridCol w:w="1000"/>
+        <w:gridCol w:w="3909"/>
+        <w:gridCol w:w="2000"/>
+        <w:gridCol w:w="1400"/>
+      </w:tblGrid>
+      <w:tr>
+        <w:trPr>
+          <w:tblHeader/>
+        </w:trPr>
+        <w:tc>
+          <w:tcPr>
+            <w:tcW w:w="1000" w:type="dxa"/>
+            <w:shd w:val="clear" w:color="auto" w:fill="D9D9D9"/>
+          </w:tcPr>
+          <w:p>
+            <w:pPr>
+              <w:spacing w:before="40" w:after="40" w:line="240" w:lineRule="auto"/>
+              <w:jc w:val="center"/>
+              <w:rPr>
+                <w:rFonts w:ascii="Times New Roman" w:cs="Times New Roman" w:eastAsia="Times New Roman" w:hAnsi="Times New Roman"/>
+                <w:b/>
+                <w:sz w:val="20"/>
+                <w:szCs w:val="20"/>
+              </w:rPr>
+            </w:pPr>
+            <w:r>
+              <w:rPr>
+                <w:rFonts w:ascii="Times New Roman" w:cs="Times New Roman" w:eastAsia="Times New Roman" w:hAnsi="Times New Roman"/>
+                <w:b/>
+                <w:sz w:val="20"/>
+                <w:szCs w:val="20"/>
+              </w:rPr>
+              <w:t xml:space="preserve">Defecto</w:t>
+            </w:r>
+          </w:p>
+        </w:tc>
+        <w:tc>
+          <w:tcPr>
+            <w:tcW w:w="3909" w:type="dxa"/>
+            <w:shd w:val="clear" w:color="auto" w:fill="D9D9D9"/>
+          </w:tcPr>
+          <w:p>
+            <w:pPr>
+              <w:spacing w:before="40" w:after="40" w:line="240" w:lineRule="auto"/>
+              <w:jc w:val="center"/>
+              <w:rPr>
+                <w:rFonts w:ascii="Times New Roman" w:cs="Times New Roman" w:eastAsia="Times New Roman" w:hAnsi="Times New Roman"/>
+                <w:b/>
+                <w:sz w:val="20"/>
+                <w:szCs w:val="20"/>
+              </w:rPr>
+            </w:pPr>
+            <w:r>
+              <w:rPr>
+                <w:rFonts w:ascii="Times New Roman" w:cs="Times New Roman" w:eastAsia="Times New Roman" w:hAnsi="Times New Roman"/>
+                <w:b/>
+                <w:sz w:val="20"/>
+                <w:szCs w:val="20"/>
+              </w:rPr>
+              <w:t xml:space="preserve">Corrección</w:t>
+            </w:r>
+          </w:p>
+        </w:tc>
+        <w:tc>
+          <w:tcPr>
+            <w:tcW w:w="2000" w:type="dxa"/>
+            <w:shd w:val="clear" w:color="auto" w:fill="D9D9D9"/>
+          </w:tcPr>
+          <w:p>
+            <w:pPr>
+              <w:spacing w:before="40" w:after="40" w:line="240" w:lineRule="auto"/>
+              <w:jc w:val="center"/>
+              <w:rPr>
+                <w:rFonts w:ascii="Times New Roman" w:cs="Times New Roman" w:eastAsia="Times New Roman" w:hAnsi="Times New Roman"/>
+                <w:b/>
+                <w:sz w:val="20"/>
+                <w:szCs w:val="20"/>
+              </w:rPr>
+            </w:pPr>
+            <w:r>
+              <w:rPr>
+                <w:rFonts w:ascii="Times New Roman" w:cs="Times New Roman" w:eastAsia="Times New Roman" w:hAnsi="Times New Roman"/>
+                <w:b/>
+                <w:sz w:val="20"/>
+                <w:szCs w:val="20"/>
+              </w:rPr>
+              <w:t xml:space="preserve">Casos repetidos</w:t>
+            </w:r>
+          </w:p>
+        </w:tc>
+        <w:tc>
+          <w:tcPr>
+            <w:tcW w:w="1400" w:type="dxa"/>
+            <w:shd w:val="clear" w:color="auto" w:fill="D9D9D9"/>
+          </w:tcPr>
+          <w:p>
+            <w:pPr>
+              <w:spacing w:before="40" w:after="40" w:line="240" w:lineRule="auto"/>
+              <w:jc w:val="center"/>
+              <w:rPr>
+                <w:rFonts w:ascii="Times New Roman" w:cs="Times New Roman" w:eastAsia="Times New Roman" w:hAnsi="Times New Roman"/>
+                <w:b/>
+                <w:sz w:val="20"/>
+                <w:szCs w:val="20"/>
+              </w:rPr>
+            </w:pPr>
+            <w:r>
+              <w:rPr>
+                <w:rFonts w:ascii="Times New Roman" w:cs="Times New Roman" w:eastAsia="Times New Roman" w:hAnsi="Times New Roman"/>
+                <w:b/>
+                <w:sz w:val="20"/>
+                <w:szCs w:val="20"/>
+              </w:rPr>
+              <w:t xml:space="preserve">Resultado</w:t>
+            </w:r>
+          </w:p>
+        </w:tc>
+      </w:tr>
+      <w:tr>
+        <w:tc>
+          <w:tcPr>
+            <w:tcW w:w="1000" w:type="dxa"/>
+          </w:tcPr>
+          <w:p>
+            <w:pPr>
+              <w:spacing w:before="40" w:after="40" w:line="240" w:lineRule="auto"/>
+              <w:jc w:val="left"/>
+              <w:rPr>
+                <w:rFonts w:ascii="Times New Roman" w:cs="Times New Roman" w:eastAsia="Times New Roman" w:hAnsi="Times New Roman"/>
+                <w:sz w:val="20"/>
+                <w:szCs w:val="20"/>
+              </w:rPr>
+            </w:pPr>
+            <w:r>
+              <w:rPr>
+                <w:rFonts w:ascii="Times New Roman" w:cs="Times New Roman" w:eastAsia="Times New Roman" w:hAnsi="Times New Roman"/>
+                <w:sz w:val="20"/>
+                <w:szCs w:val="20"/>
+              </w:rPr>
+              <w:t xml:space="preserve">DEF-12</w:t>
+            </w:r>
+          </w:p>
+        </w:tc>
+        <w:tc>
+          <w:tcPr>
+            <w:tcW w:w="3909" w:type="dxa"/>
+          </w:tcPr>
+          <w:p>
+            <w:pPr>
+              <w:spacing w:before="40" w:after="40" w:line="240" w:lineRule="auto"/>
+              <w:jc w:val="left"/>
+              <w:rPr>
+                <w:rFonts w:ascii="Times New Roman" w:cs="Times New Roman" w:eastAsia="Times New Roman" w:hAnsi="Times New Roman"/>
+                <w:sz w:val="20"/>
+                <w:szCs w:val="20"/>
+              </w:rPr>
+            </w:pPr>
+            <w:r>
+              <w:rPr>
+                <w:rFonts w:ascii="Times New Roman" w:cs="Times New Roman" w:eastAsia="Times New Roman" w:hAnsi="Times New Roman"/>
+                <w:sz w:val="20"/>
+                <w:szCs w:val="20"/>
+              </w:rPr>
+              <w:t xml:space="preserve">Microsoft.EntityFrameworkCore.Tools 6.0.36 en el csproj y nota en el README sobre el paquete que usa cada forma de regenerar las entidades.</w:t>
+            </w:r>
+          </w:p>
+        </w:tc>
+        <w:tc>
+          <w:tcPr>
+            <w:tcW w:w="2000" w:type="dxa"/>
+          </w:tcPr>
+          <w:p>
+            <w:pPr>
+              <w:spacing w:before="40" w:after="40" w:line="240" w:lineRule="auto"/>
+              <w:jc w:val="left"/>
+              <w:rPr>
+                <w:rFonts w:ascii="Times New Roman" w:cs="Times New Roman" w:eastAsia="Times New Roman" w:hAnsi="Times New Roman"/>
+                <w:sz w:val="20"/>
+                <w:szCs w:val="20"/>
+              </w:rPr>
+            </w:pPr>
+            <w:r>
+              <w:rPr>
+                <w:rFonts w:ascii="Times New Roman" w:cs="Times New Roman" w:eastAsia="Times New Roman" w:hAnsi="Times New Roman"/>
+                <w:sz w:val="20"/>
+                <w:szCs w:val="20"/>
+              </w:rPr>
+              <w:t xml:space="preserve">BK-01</w:t>
+            </w:r>
+          </w:p>
+        </w:tc>
+        <w:tc>
+          <w:tcPr>
+            <w:tcW w:w="1400" w:type="dxa"/>
+          </w:tcPr>
+          <w:p>
+            <w:pPr>
+              <w:spacing w:before="40" w:after="40" w:line="240" w:lineRule="auto"/>
+              <w:jc w:val="left"/>
+              <w:rPr>
+                <w:rFonts w:ascii="Times New Roman" w:cs="Times New Roman" w:eastAsia="Times New Roman" w:hAnsi="Times New Roman"/>
+                <w:sz w:val="20"/>
+                <w:szCs w:val="20"/>
+              </w:rPr>
+            </w:pPr>
+            <w:r>
+              <w:rPr>
+                <w:rFonts w:ascii="Times New Roman" w:cs="Times New Roman" w:eastAsia="Times New Roman" w:hAnsi="Times New Roman"/>
+                <w:sz w:val="20"/>
+                <w:szCs w:val="20"/>
+              </w:rPr>
+              <w:t xml:space="preserve">Aprobado; defecto verificado</w:t>
+            </w:r>
+          </w:p>
+        </w:tc>
+      </w:tr>
+    </w:tbl>
+    <w:p>
+      <w:pPr>
+        <w:rPr>
+          <w:rFonts w:ascii="Times New Roman" w:cs="Times New Roman" w:eastAsia="Times New Roman" w:hAnsi="Times New Roman"/>
+          <w:sz w:val="24"/>
+          <w:szCs w:val="24"/>
+        </w:rPr>
+      </w:pPr>
+      <w:r>
+        <w:rPr>
+          <w:rFonts w:ascii="Times New Roman" w:cs="Times New Roman" w:eastAsia="Times New Roman" w:hAnsi="Times New Roman"/>
+          <w:sz w:val="24"/>
+          <w:szCs w:val="24"/>
+        </w:rPr>
+        <w:t xml:space="preserve"/>
+      </w:r>
+    </w:p>
+    <w:p>
+      <w:pPr>
+        <w:spacing w:after="240"/>
+        <w:ind w:left="720" w:firstLine="0"/>
+        <w:jc w:val="center"/>
+        <w:rPr>
+          <w:rFonts w:ascii="Times New Roman" w:cs="Times New Roman" w:eastAsia="Times New Roman" w:hAnsi="Times New Roman"/>
+          <w:sz w:val="22"/>
+          <w:szCs w:val="22"/>
+        </w:rPr>
+      </w:pPr>
+      <w:r>
+        <w:rPr>
+          <w:rFonts w:ascii="Times New Roman" w:cs="Times New Roman" w:eastAsia="Times New Roman" w:hAnsi="Times New Roman"/>
+          <w:sz w:val="22"/>
+          <w:szCs w:val="22"/>
+        </w:rPr>
+        <w:t xml:space="preserve">Tabla X. Defectos corregidos en la ronda 3 y casos repetidos. Fuente: elaboración propia.</w:t>
+      </w:r>
+    </w:p>
+    <w:p>
+      <w:pPr>
+        <w:ind w:left="720" w:firstLine="0"/>
+        <w:rPr>
+          <w:rFonts w:ascii="Times New Roman" w:cs="Times New Roman" w:eastAsia="Times New Roman" w:hAnsi="Times New Roman"/>
+          <w:sz w:val="24"/>
+          <w:szCs w:val="24"/>
+        </w:rPr>
+      </w:pPr>
+      <w:r>
+        <w:rPr>
+          <w:rFonts w:ascii="Times New Roman" w:cs="Times New Roman" w:eastAsia="Times New Roman" w:hAnsi="Times New Roman"/>
+          <w:sz w:val="24"/>
+          <w:szCs w:val="24"/>
+        </w:rPr>
+        <w:t xml:space="preserve">Por lo anterior, QA aprobó el Pull Request #13, que se integró en main mediante el merge commit f68b6a5.</w:t>
       </w:r>
     </w:p>
     <w:p>

</xml_diff>